<commit_message>
Lloraderos PVC 3" en cunetas colindantes con area verde (CAR Varones y Hogar de Refugio)
- Partida nueva 01.04.03.04.03.04 y hoja METRADO LLORADEROS en los dos metrados: tramos de muro
  junto a area verde medidos en la planta de drenaje, N = REDONDEAR.MAS(L / 1.50)
- CAR Varones: 226 und (320.53 m); Hogar de Refugio: 157 und (226.21 m); demas partidas sin cambio
- Encabezados con logo de la planilla del Hogar de Refugio conservados
- Especificacion tecnica de la partida en los Word de ambos proyectos; CAR Mujeres sin cambios
- Planos PNG de verificacion de los tramos con lloraderos

Co-Authored-By: Claude Opus 5.5 <noreply@anthropic.com>
Claude-Session: https://claude.ai/code/session_0142t8T16igb3VKxUPwnQPq6
</commit_message>
<xml_diff>
--- a/entregables/ESPECIFICACIONES_TECNICAS_DRENAJE_PLUVIAL_HOGAR_REFUGIO.docx
+++ b/entregables/ESPECIFICACIONES_TECNICAS_DRENAJE_PLUVIAL_HOGAR_REFUGIO.docx
@@ -9194,6 +9194,480 @@
     </w:p>
     <w:p>
       <w:pPr>
+        <w:pStyle w:val="Heading5"/>
+        <w:keepNext/>
+      </w:pPr>
+      <w:r>
+        <w:t xml:space="preserve">01.04.03.04.03.04  LLORADERO DE TUBERIA PVC Ø3" C/FILTRO DE GRAVA Y GEOTEXTIL @1.50 m (CUNETA COLINDANTE CON AREA VERDE)  (und)</w:t>
+      </w:r>
+    </w:p>
+    <w:p>
+      <w:pPr>
+        <w:keepNext/>
+        <w:spacing w:after="60" w:before="120"/>
+      </w:pPr>
+      <w:r>
+        <w:rPr>
+          <w:rFonts w:ascii="Arial" w:cs="Arial" w:eastAsia="Arial" w:hAnsi="Arial"/>
+          <w:b/>
+          <w:bCs/>
+          <w:color w:val="1F3864"/>
+          <w:sz w:val="19"/>
+          <w:szCs w:val="19"/>
+        </w:rPr>
+        <w:t xml:space="preserve">DESCRIPCIÓN</w:t>
+      </w:r>
+    </w:p>
+    <w:p>
+      <w:pPr>
+        <w:spacing w:after="100" w:before="0" w:line="276"/>
+        <w:jc w:val="both"/>
+      </w:pPr>
+      <w:r>
+        <w:rPr>
+          <w:rFonts w:ascii="Arial" w:cs="Arial" w:eastAsia="Arial" w:hAnsi="Arial"/>
+          <w:sz w:val="20"/>
+          <w:szCs w:val="20"/>
+        </w:rPr>
+        <w:t xml:space="preserve">Comprende el suministro e instalación de los lloraderos de tubería PVC de 3" en los muros de las cunetas colindantes con áreas verdes o terreno natural sin cobertura, según el detalle de instalación de lloraderos en cunetas de evacuación pluvial y la especificación técnica del plano de drenaje: lloraderos de tubería PVC Ø 3", espaciamiento típico L = 1.50 m, que alivian la presión del agua infiltrada en el terreno por las lluvias y la descargan dentro de la cuneta.</w:t>
+      </w:r>
+    </w:p>
+    <w:p>
+      <w:pPr>
+        <w:spacing w:after="100" w:before="0" w:line="276"/>
+        <w:jc w:val="both"/>
+      </w:pPr>
+      <w:r>
+        <w:rPr>
+          <w:rFonts w:ascii="Arial" w:cs="Arial" w:eastAsia="Arial" w:hAnsi="Arial"/>
+          <w:sz w:val="20"/>
+          <w:szCs w:val="20"/>
+        </w:rPr>
+        <w:t xml:space="preserve">Cada unidad comprende: pase de tubería PVC-U de 3" (76 mm) de 0.30 m de longitud a través del muro, a media altura entre el fondo y el borde, con pendiente S = 0.5 % hacia el interior de la cuneta; filtro localizado de 0.30 x 0.30 x 0.30 m de grava filtrante (ripio de 20 a 40 mm) en el lado del terreno, envuelto íntegramente en geotextil no tejido, que retiene los finos del suelo y deja pasar el agua; y la excavación local y el relleno compactado alrededor del filtro.</w:t>
+      </w:r>
+    </w:p>
+    <w:p>
+      <w:pPr>
+        <w:spacing w:after="100" w:before="0" w:line="276"/>
+        <w:jc w:val="both"/>
+      </w:pPr>
+      <w:r>
+        <w:rPr>
+          <w:rFonts w:ascii="Arial" w:cs="Arial" w:eastAsia="Arial" w:hAnsi="Arial"/>
+          <w:sz w:val="20"/>
+          <w:szCs w:val="20"/>
+        </w:rPr>
+        <w:t xml:space="preserve">Ubicación: solo en los tramos de muro de cuneta colindantes con área verde de la hoja METRADO LLORADEROS (eje, lado del muro y progresivas); los tramos junto a veredas, pisos o edificaciones no llevan lloraderos.</w:t>
+      </w:r>
+    </w:p>
+    <w:p>
+      <w:pPr>
+        <w:keepNext/>
+        <w:spacing w:after="60" w:before="120"/>
+      </w:pPr>
+      <w:r>
+        <w:rPr>
+          <w:rFonts w:ascii="Arial" w:cs="Arial" w:eastAsia="Arial" w:hAnsi="Arial"/>
+          <w:b/>
+          <w:bCs/>
+          <w:color w:val="1F3864"/>
+          <w:sz w:val="19"/>
+          <w:szCs w:val="19"/>
+        </w:rPr>
+        <w:t xml:space="preserve">MATERIALES</w:t>
+      </w:r>
+    </w:p>
+    <w:p>
+      <w:pPr>
+        <w:pStyle w:val="ListParagraph"/>
+        <w:numPr>
+          <w:ilvl w:val="0"/>
+          <w:numId w:val="2"/>
+        </w:numPr>
+        <w:spacing w:after="60" w:line="264"/>
+        <w:jc w:val="both"/>
+      </w:pPr>
+      <w:r>
+        <w:rPr>
+          <w:rFonts w:ascii="Arial" w:cs="Arial" w:eastAsia="Arial" w:hAnsi="Arial"/>
+          <w:sz w:val="20"/>
+          <w:szCs w:val="20"/>
+        </w:rPr>
+        <w:t xml:space="preserve">Tubería PVC-U para desagüe de 3" (NTP 399.003), cortada en tramos de 0.30 m.</w:t>
+      </w:r>
+    </w:p>
+    <w:p>
+      <w:pPr>
+        <w:pStyle w:val="ListParagraph"/>
+        <w:numPr>
+          <w:ilvl w:val="0"/>
+          <w:numId w:val="2"/>
+        </w:numPr>
+        <w:spacing w:after="60" w:line="264"/>
+        <w:jc w:val="both"/>
+      </w:pPr>
+      <w:r>
+        <w:rPr>
+          <w:rFonts w:ascii="Arial" w:cs="Arial" w:eastAsia="Arial" w:hAnsi="Arial"/>
+          <w:sz w:val="20"/>
+          <w:szCs w:val="20"/>
+        </w:rPr>
+        <w:t xml:space="preserve">Grava filtrante (ripio) de 20 a 40 mm, limpia, lavada, sin finos ni materia orgánica: 0.027 m³ por lloradero.</w:t>
+      </w:r>
+    </w:p>
+    <w:p>
+      <w:pPr>
+        <w:pStyle w:val="ListParagraph"/>
+        <w:numPr>
+          <w:ilvl w:val="0"/>
+          <w:numId w:val="2"/>
+        </w:numPr>
+        <w:spacing w:after="60" w:line="264"/>
+        <w:jc w:val="both"/>
+      </w:pPr>
+      <w:r>
+        <w:rPr>
+          <w:rFonts w:ascii="Arial" w:cs="Arial" w:eastAsia="Arial" w:hAnsi="Arial"/>
+          <w:sz w:val="20"/>
+          <w:szCs w:val="20"/>
+        </w:rPr>
+        <w:t xml:space="preserve">Geotextil no tejido (NTP / ASTM D4491 y D4751, clase 2 para filtro): 0.60 m² por lloradero, con traslapes de 0.10 m.</w:t>
+      </w:r>
+    </w:p>
+    <w:p>
+      <w:pPr>
+        <w:pStyle w:val="ListParagraph"/>
+        <w:numPr>
+          <w:ilvl w:val="0"/>
+          <w:numId w:val="2"/>
+        </w:numPr>
+        <w:spacing w:after="60" w:line="264"/>
+        <w:jc w:val="both"/>
+      </w:pPr>
+      <w:r>
+        <w:rPr>
+          <w:rFonts w:ascii="Arial" w:cs="Arial" w:eastAsia="Arial" w:hAnsi="Arial"/>
+          <w:sz w:val="20"/>
+          <w:szCs w:val="20"/>
+        </w:rPr>
+        <w:t xml:space="preserve">Mortero 1:3 cemento-arena para sellar el contorno del tubo en el muro.</w:t>
+      </w:r>
+    </w:p>
+    <w:p>
+      <w:pPr>
+        <w:keepNext/>
+        <w:spacing w:after="60" w:before="120"/>
+      </w:pPr>
+      <w:r>
+        <w:rPr>
+          <w:rFonts w:ascii="Arial" w:cs="Arial" w:eastAsia="Arial" w:hAnsi="Arial"/>
+          <w:b/>
+          <w:bCs/>
+          <w:color w:val="1F3864"/>
+          <w:sz w:val="19"/>
+          <w:szCs w:val="19"/>
+        </w:rPr>
+        <w:t xml:space="preserve">EQUIPOS Y HERRAMIENTAS</w:t>
+      </w:r>
+    </w:p>
+    <w:p>
+      <w:pPr>
+        <w:pStyle w:val="ListParagraph"/>
+        <w:numPr>
+          <w:ilvl w:val="0"/>
+          <w:numId w:val="2"/>
+        </w:numPr>
+        <w:spacing w:after="60" w:line="264"/>
+        <w:jc w:val="both"/>
+      </w:pPr>
+      <w:r>
+        <w:rPr>
+          <w:rFonts w:ascii="Arial" w:cs="Arial" w:eastAsia="Arial" w:hAnsi="Arial"/>
+          <w:sz w:val="20"/>
+          <w:szCs w:val="20"/>
+        </w:rPr>
+        <w:t xml:space="preserve">Herramientas manuales, sierra de arco, nivel, wincha, pisón de mano.</w:t>
+      </w:r>
+    </w:p>
+    <w:p>
+      <w:pPr>
+        <w:keepNext/>
+        <w:spacing w:after="60" w:before="120"/>
+      </w:pPr>
+      <w:r>
+        <w:rPr>
+          <w:rFonts w:ascii="Arial" w:cs="Arial" w:eastAsia="Arial" w:hAnsi="Arial"/>
+          <w:b/>
+          <w:bCs/>
+          <w:color w:val="1F3864"/>
+          <w:sz w:val="19"/>
+          <w:szCs w:val="19"/>
+        </w:rPr>
+        <w:t xml:space="preserve">PROCEDIMIENTO DE EJECUCIÓN</w:t>
+      </w:r>
+    </w:p>
+    <w:p>
+      <w:pPr>
+        <w:pStyle w:val="ListParagraph"/>
+        <w:numPr>
+          <w:ilvl w:val="0"/>
+          <w:numId w:val="2"/>
+        </w:numPr>
+        <w:spacing w:after="60" w:line="264"/>
+        <w:jc w:val="both"/>
+      </w:pPr>
+      <w:r>
+        <w:rPr>
+          <w:rFonts w:ascii="Arial" w:cs="Arial" w:eastAsia="Arial" w:hAnsi="Arial"/>
+          <w:sz w:val="20"/>
+          <w:szCs w:val="20"/>
+        </w:rPr>
+        <w:t xml:space="preserve">Antes del vaciado de los muros, fijar al encofrado los tubos de 3" @1.50 m en los tramos indicados, a media altura del muro y con pendiente de 0.5 % hacia la cuneta, tapados en sus extremos para que no entre concreto; el primero y el último a no menos de 0.30 m de las juntas de dilatación.</w:t>
+      </w:r>
+    </w:p>
+    <w:p>
+      <w:pPr>
+        <w:pStyle w:val="ListParagraph"/>
+        <w:numPr>
+          <w:ilvl w:val="0"/>
+          <w:numId w:val="2"/>
+        </w:numPr>
+        <w:spacing w:after="60" w:line="264"/>
+        <w:jc w:val="both"/>
+      </w:pPr>
+      <w:r>
+        <w:rPr>
+          <w:rFonts w:ascii="Arial" w:cs="Arial" w:eastAsia="Arial" w:hAnsi="Arial"/>
+          <w:sz w:val="20"/>
+          <w:szCs w:val="20"/>
+        </w:rPr>
+        <w:t xml:space="preserve">Después del desencofrado, destapar los tubos y verificar que queden libres; sellar con mortero cualquier vacío alrededor del tubo.</w:t>
+      </w:r>
+    </w:p>
+    <w:p>
+      <w:pPr>
+        <w:pStyle w:val="ListParagraph"/>
+        <w:numPr>
+          <w:ilvl w:val="0"/>
+          <w:numId w:val="2"/>
+        </w:numPr>
+        <w:spacing w:after="60" w:line="264"/>
+        <w:jc w:val="both"/>
+      </w:pPr>
+      <w:r>
+        <w:rPr>
+          <w:rFonts w:ascii="Arial" w:cs="Arial" w:eastAsia="Arial" w:hAnsi="Arial"/>
+          <w:sz w:val="20"/>
+          <w:szCs w:val="20"/>
+        </w:rPr>
+        <w:t xml:space="preserve">En el lado del terreno, excavar un hueco de 0.30 x 0.30 x 0.30 m centrado en cada tubo, forrarlo con el geotextil, llenarlo con la grava y cerrar el geotextil por encima con traslape de 0.10 m.</w:t>
+      </w:r>
+    </w:p>
+    <w:p>
+      <w:pPr>
+        <w:pStyle w:val="ListParagraph"/>
+        <w:numPr>
+          <w:ilvl w:val="0"/>
+          <w:numId w:val="2"/>
+        </w:numPr>
+        <w:spacing w:after="60" w:line="264"/>
+        <w:jc w:val="both"/>
+      </w:pPr>
+      <w:r>
+        <w:rPr>
+          <w:rFonts w:ascii="Arial" w:cs="Arial" w:eastAsia="Arial" w:hAnsi="Arial"/>
+          <w:sz w:val="20"/>
+          <w:szCs w:val="20"/>
+        </w:rPr>
+        <w:t xml:space="preserve">Rellenar y compactar el resto de la zanja con la partida de relleno, sin dañar el filtro.</w:t>
+      </w:r>
+    </w:p>
+    <w:p>
+      <w:pPr>
+        <w:keepNext/>
+        <w:spacing w:after="60" w:before="120"/>
+      </w:pPr>
+      <w:r>
+        <w:rPr>
+          <w:rFonts w:ascii="Arial" w:cs="Arial" w:eastAsia="Arial" w:hAnsi="Arial"/>
+          <w:b/>
+          <w:bCs/>
+          <w:color w:val="1F3864"/>
+          <w:sz w:val="19"/>
+          <w:szCs w:val="19"/>
+        </w:rPr>
+        <w:t xml:space="preserve">CONTROL DE CALIDAD Y TOLERANCIAS</w:t>
+      </w:r>
+    </w:p>
+    <w:p>
+      <w:pPr>
+        <w:pStyle w:val="ListParagraph"/>
+        <w:numPr>
+          <w:ilvl w:val="0"/>
+          <w:numId w:val="2"/>
+        </w:numPr>
+        <w:spacing w:after="60" w:line="264"/>
+        <w:jc w:val="both"/>
+      </w:pPr>
+      <w:r>
+        <w:rPr>
+          <w:rFonts w:ascii="Arial" w:cs="Arial" w:eastAsia="Arial" w:hAnsi="Arial"/>
+          <w:sz w:val="20"/>
+          <w:szCs w:val="20"/>
+        </w:rPr>
+        <w:t xml:space="preserve">Ubicación y espaciamiento según la hoja de metrado (tolerancia ±0.10 m); tubo libre y con pendiente hacia la cuneta; filtro completo, con el geotextil cerrado y sin contaminación de tierra.</w:t>
+      </w:r>
+    </w:p>
+    <w:p>
+      <w:pPr>
+        <w:pStyle w:val="ListParagraph"/>
+        <w:numPr>
+          <w:ilvl w:val="0"/>
+          <w:numId w:val="2"/>
+        </w:numPr>
+        <w:spacing w:after="60" w:line="264"/>
+        <w:jc w:val="both"/>
+      </w:pPr>
+      <w:r>
+        <w:rPr>
+          <w:rFonts w:ascii="Arial" w:cs="Arial" w:eastAsia="Arial" w:hAnsi="Arial"/>
+          <w:sz w:val="20"/>
+          <w:szCs w:val="20"/>
+        </w:rPr>
+        <w:t xml:space="preserve">Prueba: al echar agua en el filtro, debe salir por el lloradero dentro de la cuneta.</w:t>
+      </w:r>
+    </w:p>
+    <w:p>
+      <w:pPr>
+        <w:keepNext/>
+        <w:spacing w:after="60" w:before="120"/>
+      </w:pPr>
+      <w:r>
+        <w:rPr>
+          <w:rFonts w:ascii="Arial" w:cs="Arial" w:eastAsia="Arial" w:hAnsi="Arial"/>
+          <w:b/>
+          <w:bCs/>
+          <w:color w:val="1F3864"/>
+          <w:sz w:val="19"/>
+          <w:szCs w:val="19"/>
+        </w:rPr>
+        <w:t xml:space="preserve">SEGURIDAD Y SALUD EN EL TRABAJO</w:t>
+      </w:r>
+    </w:p>
+    <w:p>
+      <w:pPr>
+        <w:pStyle w:val="ListParagraph"/>
+        <w:numPr>
+          <w:ilvl w:val="0"/>
+          <w:numId w:val="2"/>
+        </w:numPr>
+        <w:spacing w:after="60" w:line="264"/>
+        <w:jc w:val="both"/>
+      </w:pPr>
+      <w:r>
+        <w:rPr>
+          <w:rFonts w:ascii="Arial" w:cs="Arial" w:eastAsia="Arial" w:hAnsi="Arial"/>
+          <w:sz w:val="20"/>
+          <w:szCs w:val="20"/>
+        </w:rPr>
+        <w:t xml:space="preserve">Uso obligatorio de equipo de protección personal: casco, lentes de seguridad, guantes, botas con puntera de acero y chaleco reflectivo (DS N.° 011-2019-TR y Norma G.050).</w:t>
+      </w:r>
+    </w:p>
+    <w:p>
+      <w:pPr>
+        <w:keepNext/>
+        <w:spacing w:after="60" w:before="120"/>
+      </w:pPr>
+      <w:r>
+        <w:rPr>
+          <w:rFonts w:ascii="Arial" w:cs="Arial" w:eastAsia="Arial" w:hAnsi="Arial"/>
+          <w:b/>
+          <w:bCs/>
+          <w:color w:val="1F3864"/>
+          <w:sz w:val="19"/>
+          <w:szCs w:val="19"/>
+        </w:rPr>
+        <w:t xml:space="preserve">UNIDAD DE MEDIDA</w:t>
+      </w:r>
+    </w:p>
+    <w:p>
+      <w:pPr>
+        <w:spacing w:after="100" w:before="0" w:line="276"/>
+        <w:jc w:val="both"/>
+      </w:pPr>
+      <w:r>
+        <w:rPr>
+          <w:rFonts w:ascii="Arial" w:cs="Arial" w:eastAsia="Arial" w:hAnsi="Arial"/>
+          <w:sz w:val="20"/>
+          <w:szCs w:val="20"/>
+        </w:rPr>
+        <w:t xml:space="preserve">La unidad de medida es: unidad (und).</w:t>
+      </w:r>
+    </w:p>
+    <w:p>
+      <w:pPr>
+        <w:keepNext/>
+        <w:spacing w:after="60" w:before="120"/>
+      </w:pPr>
+      <w:r>
+        <w:rPr>
+          <w:rFonts w:ascii="Arial" w:cs="Arial" w:eastAsia="Arial" w:hAnsi="Arial"/>
+          <w:b/>
+          <w:bCs/>
+          <w:color w:val="1F3864"/>
+          <w:sz w:val="19"/>
+          <w:szCs w:val="19"/>
+        </w:rPr>
+        <w:t xml:space="preserve">MÉTODO DE MEDICIÓN</w:t>
+      </w:r>
+    </w:p>
+    <w:p>
+      <w:pPr>
+        <w:spacing w:after="100" w:before="0" w:line="276"/>
+        <w:jc w:val="both"/>
+      </w:pPr>
+      <w:r>
+        <w:rPr>
+          <w:rFonts w:ascii="Arial" w:cs="Arial" w:eastAsia="Arial" w:hAnsi="Arial"/>
+          <w:sz w:val="20"/>
+          <w:szCs w:val="20"/>
+        </w:rPr>
+        <w:t xml:space="preserve">Se contará el número de lloraderos instalados y aprobados, con su filtro, en los tramos de la hoja METRADO LLORADEROS.</w:t>
+      </w:r>
+    </w:p>
+    <w:p>
+      <w:pPr>
+        <w:keepNext/>
+        <w:spacing w:after="60" w:before="120"/>
+      </w:pPr>
+      <w:r>
+        <w:rPr>
+          <w:rFonts w:ascii="Arial" w:cs="Arial" w:eastAsia="Arial" w:hAnsi="Arial"/>
+          <w:b/>
+          <w:bCs/>
+          <w:color w:val="1F3864"/>
+          <w:sz w:val="19"/>
+          <w:szCs w:val="19"/>
+        </w:rPr>
+        <w:t xml:space="preserve">FORMA DE PAGO</w:t>
+      </w:r>
+    </w:p>
+    <w:p>
+      <w:pPr>
+        <w:spacing w:after="100" w:before="0" w:line="276"/>
+        <w:jc w:val="both"/>
+      </w:pPr>
+      <w:r>
+        <w:rPr>
+          <w:rFonts w:ascii="Arial" w:cs="Arial" w:eastAsia="Arial" w:hAnsi="Arial"/>
+          <w:sz w:val="20"/>
+          <w:szCs w:val="20"/>
+        </w:rPr>
+        <w:t xml:space="preserve">El pago se efectuará al precio unitario del presupuesto por unidad (und), de acuerdo con el avance valorizado y con la conformidad de la Supervisión. Dicho precio y pago constituye compensación total por la mano de obra (incluidas las leyes sociales), los materiales, el equipo, las herramientas, el transporte interno y todo imprevisto necesario para ejecutar la partida según esta especificación y los planos.</w:t>
+      </w:r>
+    </w:p>
+    <w:p>
+      <w:pPr>
         <w:pStyle w:val="Heading3"/>
         <w:keepNext/>
       </w:pPr>

</xml_diff>

<commit_message>
Caja sumidero de piso: isometricos, corte, planta y desagregado (DS-01, DS-02) con salida directa y codo de 90 grados, sin trampa; especificacion de Varones y Hogar de Refugio actualizada
Co-Authored-By: Claude Opus 5.5 <noreply@anthropic.com>
Claude-Session: https://claude.ai/code/session_0142t8T16igb3VKxUPwnQPq6
</commit_message>
<xml_diff>
--- a/entregables/ESPECIFICACIONES_TECNICAS_DRENAJE_PLUVIAL_HOGAR_REFUGIO.docx
+++ b/entregables/ESPECIFICACIONES_TECNICAS_DRENAJE_PLUVIAL_HOGAR_REFUGIO.docx
@@ -13545,7 +13545,7 @@
           <w:sz w:val="20"/>
           <w:szCs w:val="20"/>
         </w:rPr>
-        <w:t xml:space="preserve">Comprende el suministro e instalación de la caja sumidero de 4" en las áreas de piso del primer piso, según el detalle de caja sumidero de los planos: rejilla metálica de platinas de 1" x 3/16" de 0.25 m de lado sobre marco de ángulo L 1" x 1" x 3/16" fijado al concreto con anclajes de fierro de 3" x 3/8", caja de 0.10 m de profundidad bajo la rejilla con fondo inclinado hacia la salida, trampa y salida de PVC de 4" conectada a la red de piso.</w:t>
+        <w:t xml:space="preserve">Comprende el suministro e instalación de la caja sumidero de 4" en las áreas de piso del primer piso, según el detalle de caja sumidero de los planos: rejilla metálica de platinas de 1" x 3/16" de 0.25 m de lado sobre marco de ángulo L 1" x 1" x 3/16" fijado al concreto con anclajes de fierro de 3" x 3/8", caja de 0.10 m de profundidad bajo la rejilla con fondo inclinado hacia la salida, salida de PVC de 4" en el centro del fondo de la caja y un codo de 90° hacia la tubería de 4" que descarga en la cuneta (sin trampa ni sifon).</w:t>
       </w:r>
     </w:p>
     <w:p>
@@ -13672,7 +13672,7 @@
           <w:sz w:val="20"/>
           <w:szCs w:val="20"/>
         </w:rPr>
-        <w:t xml:space="preserve">Formar la caja de 0.10 m con fondo inclinado hacia la salida y conectarla a la tubería de 4" con su trampa y accesorios.</w:t>
+        <w:t xml:space="preserve">Formar la caja de 0.10 m con fondo inclinado hacia la salida y conectarla con el codo de 90° a la tubería de 4" que descarga en la cuneta.</w:t>
       </w:r>
     </w:p>
     <w:p>

</xml_diff>

<commit_message>
Hogar de Refugio: planos, isometricos y especificaciones con el contramarco L 1 1/2"x1 1/2"x1/8"
- Contramarco configurable por proyecto (metrado_calc.CM, variable CONTRAMARCO);
  CAR Varones conserva el L 2"x2"x3/16" (planos y Word sin cambios, verificado).
- DD-01, DD-02, DP-06B, DP-08, DP-09 y DA-03: angulo, luz libre 0.62, asiento 38.1 mm,
  cordon 1/8", pesos y pintura.
- DP-06B aparte, lamina 3D de 4 vistas e isometricos de la tapa regenerados.
- Especificaciones tecnicas y memoria del Hogar de Refugio actualizadas.

Co-Authored-By: Claude Opus 5.5 <noreply@anthropic.com>
Claude-Session: https://claude.ai/code/session_0142t8T16igb3VKxUPwnQPq6
</commit_message>
<xml_diff>
--- a/entregables/ESPECIFICACIONES_TECNICAS_DRENAJE_PLUVIAL_HOGAR_REFUGIO.docx
+++ b/entregables/ESPECIFICACIONES_TECNICAS_DRENAJE_PLUVIAL_HOGAR_REFUGIO.docx
@@ -20488,7 +20488,7 @@
           <w:sz w:val="20"/>
           <w:szCs w:val="20"/>
         </w:rPr>
-        <w:t xml:space="preserve">Comprende el registro de limpieza completo del colector pluvial frontal del Hogar de Refugio Temporal: contramarco de ángulo L 2" x 2" x 3/16" de 0.70 x 0.70 m con 8 anclajes de 3/8" embutido en la abertura de la losa, borde engrosado de 0.15 x 0.10 m bajo la losa con refuerzo de 2 barras de 1/2" por lado, y tapa de concreto armado f'c = 210 kg/cm² de 0.68 x 0.68 x 0.08 m con marco de ángulo L 1 1/2" x 1 1/2" x 1/8", parrilla de 7 + 7 barras de 3/8" @0.10 m y dos asas de 3/8" liso, todo según la lámina DP-06B.</w:t>
+        <w:t xml:space="preserve">Comprende el registro de limpieza completo del colector pluvial frontal del Hogar de Refugio Temporal: contramarco de ángulo L 1 1/2" x 1 1/2" x 1/8" de 0.70 x 0.70 m con 8 anclajes de 3/8" embutido en la abertura de la losa, borde engrosado de 0.15 x 0.10 m bajo la losa con refuerzo de 2 barras de 1/2" por lado, y tapa de concreto armado f'c = 210 kg/cm² de 0.68 x 0.68 x 0.08 m con marco de ángulo L 1 1/2" x 1 1/2" x 1/8", parrilla de 7 + 7 barras de 3/8" @0.10 m y dos asas de 3/8" liso, todo según la lámina DP-06B.</w:t>
       </w:r>
     </w:p>
     <w:p>
@@ -20907,7 +20907,7 @@
         <w:keepNext/>
       </w:pPr>
       <w:r>
-        <w:t xml:space="preserve">01.04.04.06.01  JUNTA DE DILATACION E=1" CON TECNOPOR Y SELLADOR ELASTOMERICO  (m)</w:t>
+        <w:t xml:space="preserve">01.04.04.06.01  JUNTA DE DILATACION E=1" CON TECNOPOR Y SELLADOR ASFALTICO EN COLECTOR  (m)</w:t>
       </w:r>
     </w:p>
     <w:p>
@@ -20938,7 +20938,7 @@
           <w:sz w:val="20"/>
           <w:szCs w:val="20"/>
         </w:rPr>
-        <w:t xml:space="preserve">Comprende la junta de dilatación de 1" (25 mm) en toda la sección del colector pluvial frontal del Hogar de Refugio Temporal, cada 4.00 m (17 juntas) y en los cambios de sección, rellena con plancha de poliestireno expandido (tecnopor) y sellada con sellador elastomérico de poliuretano de 25 x 25 mm (ASTM C920) en las caras interiores y en la cara superior.</w:t>
+        <w:t xml:space="preserve">Comprende la junta de dilatación de 1" (25 mm) en toda la sección del colector pluvial frontal del Hogar de Refugio Temporal, cada 4.00 m (17 juntas) y en los cambios de sección, rellena con plancha de poliestireno expandido (tecnopor) y sellada con sellador asfáltico en las caras interiores y en la cara superior.</w:t>
       </w:r>
     </w:p>
     <w:p>
@@ -20974,7 +20974,7 @@
           <w:sz w:val="20"/>
           <w:szCs w:val="20"/>
         </w:rPr>
-        <w:t xml:space="preserve">Plancha de tecnopor de 1" (densidad 15 kg/m³); sellador elastomérico de poliuretano de 25 x 25 mm (ASTM C920); imprimante del sellador; cinta de respaldo.</w:t>
+        <w:t xml:space="preserve">Plancha de tecnopor de 1" (densidad 15 kg/m³); sellador asfáltico; imprimante del sellador; cinta de respaldo.</w:t>
       </w:r>
     </w:p>
     <w:p>
@@ -21296,7 +21296,7 @@
         <w:keepNext/>
       </w:pPr>
       <w:r>
-        <w:t xml:space="preserve">01.04.04.06.02  JUNTA E=1" CON TECNOPOR ENTRE COLECTOR Y PISO ADYACENTE  (m)</w:t>
+        <w:t xml:space="preserve">01.04.04.06.02  JUNTA E=1" CON TECNOPOR Y SELLADOR ASFALTICO ENTRE COLECTOR Y CERCO PERIMETRICO  (m)</w:t>
       </w:r>
     </w:p>
     <w:p>

</xml_diff>

<commit_message>
Hogar de Refugio: juntas del colector y con el cerco con tecnopor y sellador asfaltico 1"x2" en planos, especificaciones y memoria
- Sellador de las juntas configurable por proyecto (metrado_calc.SELLO, variable SELLO_JUNTA);
  CAR Varones conserva el sello de poliuretano (planos y Word sin cambios, verificado).
- DD-03: sellador asfaltico RC-250 + arena de 1" x 2" en la junta de dilatacion, contra el cerco
  y en el borde de la losa; cuadro de componentes con la mezcla del sellador; procedimiento EG-2013 510.
- DP-08 y DA-03: textos de las juntas; especificaciones y memoria coherentes con los planos.

Co-Authored-By: Claude Opus 5.5 <noreply@anthropic.com>
Claude-Session: https://claude.ai/code/session_0142t8T16igb3VKxUPwnQPq6
</commit_message>
<xml_diff>
--- a/entregables/ESPECIFICACIONES_TECNICAS_DRENAJE_PLUVIAL_HOGAR_REFUGIO.docx
+++ b/entregables/ESPECIFICACIONES_TECNICAS_DRENAJE_PLUVIAL_HOGAR_REFUGIO.docx
@@ -1461,7 +1461,7 @@
                 <w:sz w:val="17"/>
                 <w:szCs w:val="17"/>
               </w:rPr>
-              <w:t xml:space="preserve">Poliestireno expandido (tecnopor) de 1"; sellador asfáltico para juntas de cunetas; sellador de poliuretano en el colector</w:t>
+              <w:t xml:space="preserve">Poliestireno expandido (tecnopor) de 1"; sellador asfáltico (asfalto líquido RC-250 + arena gruesa) en las juntas de cunetas y del colector</w:t>
             </w:r>
           </w:p>
         </w:tc>
@@ -1493,7 +1493,7 @@
                 <w:sz w:val="17"/>
                 <w:szCs w:val="17"/>
               </w:rPr>
-              <w:t xml:space="preserve">ASTM C920</w:t>
+              <w:t xml:space="preserve">NTP 321.028 / EG-2013 MTC 510</w:t>
             </w:r>
           </w:p>
         </w:tc>
@@ -20938,7 +20938,7 @@
           <w:sz w:val="20"/>
           <w:szCs w:val="20"/>
         </w:rPr>
-        <w:t xml:space="preserve">Comprende la junta de dilatación de 1" (25 mm) en toda la sección del colector pluvial frontal del Hogar de Refugio Temporal, cada 4.00 m (17 juntas) y en los cambios de sección, rellena con plancha de poliestireno expandido (tecnopor) y sellada con sellador asfáltico en las caras interiores y en la cara superior.</w:t>
+        <w:t xml:space="preserve">Comprende la junta de dilatación de 1" (25 mm) en toda la sección del colector pluvial frontal del Hogar de Refugio Temporal, cada 4.00 m (17 juntas) y en los cambios de sección, rellena con plancha de poliestireno expandido (tecnopor) y sellada con sellador asfáltico de 1" x 2" (25 x 50 mm) de asfalto líquido RC-250 y arena gruesa en las caras interiores y en la cara superior, según la lámina DD-03 y la sección 510 de la EG-2013 del MTC.</w:t>
       </w:r>
     </w:p>
     <w:p>
@@ -20974,7 +20974,7 @@
           <w:sz w:val="20"/>
           <w:szCs w:val="20"/>
         </w:rPr>
-        <w:t xml:space="preserve">Plancha de tecnopor de 1" (densidad 15 kg/m³); sellador asfáltico; imprimante del sellador; cinta de respaldo.</w:t>
+        <w:t xml:space="preserve">Plancha de tecnopor de 1" (densidad 10 a 15 kg/m³); asfalto líquido RC-250 (NTP 321.028); arena gruesa limpia y seca.</w:t>
       </w:r>
     </w:p>
     <w:p>
@@ -21010,7 +21010,7 @@
           <w:sz w:val="20"/>
           <w:szCs w:val="20"/>
         </w:rPr>
-        <w:t xml:space="preserve">Cuchilla, pistola de calafateo, espátula, escobilla, compresora o soplador.</w:t>
+        <w:t xml:space="preserve">Cuchilla, recipiente o tetera para calentar el asfalto, tacos de madera, escobilla, soplador.</w:t>
       </w:r>
     </w:p>
     <w:p>
@@ -21084,7 +21084,26 @@
           <w:sz w:val="20"/>
           <w:szCs w:val="20"/>
         </w:rPr>
-        <w:t xml:space="preserve">Retirar 25 mm de tecnopor en las caras interiores y en la cara superior; limpiar y secar, aplicar el imprimante y el sellador con pistola, y alisar.</w:t>
+        <w:t xml:space="preserve">Retirar 2" (50 mm) de tecnopor en las caras interiores y en la cara superior; limpiar y secar la caja de la junta.</w:t>
+      </w:r>
+    </w:p>
+    <w:p>
+      <w:pPr>
+        <w:pStyle w:val="ListParagraph"/>
+        <w:numPr>
+          <w:ilvl w:val="0"/>
+          <w:numId w:val="2"/>
+        </w:numPr>
+        <w:spacing w:after="60" w:line="264"/>
+        <w:jc w:val="both"/>
+      </w:pPr>
+      <w:r>
+        <w:rPr>
+          <w:rFonts w:ascii="Arial" w:cs="Arial" w:eastAsia="Arial" w:hAnsi="Arial"/>
+          <w:sz w:val="20"/>
+          <w:szCs w:val="20"/>
+        </w:rPr>
+        <w:t xml:space="preserve">Calentar el asfalto líquido RC-250, mezclarlo con arena gruesa y colocar la mezcla compactándola con tacos de madera hasta el ras; retirar lo que manche el concreto.</w:t>
       </w:r>
     </w:p>
     <w:p>
@@ -21139,7 +21158,7 @@
           <w:sz w:val="20"/>
           <w:szCs w:val="20"/>
         </w:rPr>
-        <w:t xml:space="preserve">Sellador adherido en ambas caras, sin burbujas ni discontinuidades.</w:t>
+        <w:t xml:space="preserve">Sello compacto, adherido a ambas caras y al ras, sin vacíos ni discontinuidades.</w:t>
       </w:r>
     </w:p>
     <w:p>
@@ -21194,7 +21213,7 @@
           <w:sz w:val="20"/>
           <w:szCs w:val="20"/>
         </w:rPr>
-        <w:t xml:space="preserve">Ventilar al aplicar imprimantes y selladores; mantenerlos lejos del fuego.</w:t>
+        <w:t xml:space="preserve">Calentar el asfalto lejos de materiales inflamables, con extintor a la mano; guantes y careta.</w:t>
       </w:r>
     </w:p>
     <w:p>
@@ -21327,7 +21346,7 @@
           <w:sz w:val="20"/>
           <w:szCs w:val="20"/>
         </w:rPr>
-        <w:t xml:space="preserve">Comprende la junta de 1" con plancha de poliestireno expandido (tecnopor) entre el colector pluvial frontal del Hogar de Refugio Temporal y las estructuras vecinas: borde de la losa superior con el piso adyacente a ambos lados, el cerco existente, de modo que cada estructura trabaje en forma independiente.</w:t>
+        <w:t xml:space="preserve">Comprende la junta de 1" con plancha de poliestireno expandido (tecnopor) y sellador asfáltico entre el colector pluvial frontal del Hogar de Refugio Temporal y las estructuras vecinas: cimiento del cerco existente (plancha de 0.90 m de altura) y borde de la losa superior con el piso adyacente (plancha de 0.10 m), de modo que cada estructura trabaje en forma independiente. En la cara superior de la junta se coloca sellador asfáltico de 1" x 2" (asfalto líquido RC-250 + arena gruesa), según la lámina DD-03.</w:t>
       </w:r>
     </w:p>
     <w:p>
@@ -21363,7 +21382,7 @@
           <w:sz w:val="20"/>
           <w:szCs w:val="20"/>
         </w:rPr>
-        <w:t xml:space="preserve">Plancha de tecnopor de 1" (densidad 15 kg/m³) en tiras de 0.10 m de altura para el borde de la losa; pegamento compatible.</w:t>
+        <w:t xml:space="preserve">Plancha de tecnopor de 1" (densidad 10 a 15 kg/m³) en tiras de 0.90 m y de 0.10 m de altura; asfalto líquido RC-250 (NTP 321.028); arena gruesa limpia y seca.</w:t>
       </w:r>
     </w:p>
     <w:p>
@@ -21399,7 +21418,7 @@
           <w:sz w:val="20"/>
           <w:szCs w:val="20"/>
         </w:rPr>
-        <w:t xml:space="preserve">Cuchilla, regla, wincha.</w:t>
+        <w:t xml:space="preserve">Cuchilla, regla, wincha, recipiente para calentar el asfalto, tacos de madera.</w:t>
       </w:r>
     </w:p>
     <w:p>
@@ -21435,26 +21454,45 @@
           <w:sz w:val="20"/>
           <w:szCs w:val="20"/>
         </w:rPr>
-        <w:t xml:space="preserve">Fijar la tira de tecnopor contra el borde de la losa del colector antes de vaciar el piso adyacente.</w:t>
-      </w:r>
-    </w:p>
-    <w:p>
-      <w:pPr>
-        <w:pStyle w:val="ListParagraph"/>
-        <w:numPr>
-          <w:ilvl w:val="0"/>
-          <w:numId w:val="2"/>
-        </w:numPr>
-        <w:spacing w:after="60" w:line="264"/>
-        <w:jc w:val="both"/>
-      </w:pPr>
-      <w:r>
-        <w:rPr>
-          <w:rFonts w:ascii="Arial" w:cs="Arial" w:eastAsia="Arial" w:hAnsi="Arial"/>
-          <w:sz w:val="20"/>
-          <w:szCs w:val="20"/>
-        </w:rPr>
-        <w:t xml:space="preserve">Mantenerla vertical y continua; retirar los excesos al ras del piso.</w:t>
+        <w:t xml:space="preserve">Pegar la plancha al cimiento del cerco antes de vaciar el muro del colector, y la tira de 0.10 m contra el borde de la losa antes de vaciar el piso adyacente.</w:t>
+      </w:r>
+    </w:p>
+    <w:p>
+      <w:pPr>
+        <w:pStyle w:val="ListParagraph"/>
+        <w:numPr>
+          <w:ilvl w:val="0"/>
+          <w:numId w:val="2"/>
+        </w:numPr>
+        <w:spacing w:after="60" w:line="264"/>
+        <w:jc w:val="both"/>
+      </w:pPr>
+      <w:r>
+        <w:rPr>
+          <w:rFonts w:ascii="Arial" w:cs="Arial" w:eastAsia="Arial" w:hAnsi="Arial"/>
+          <w:sz w:val="20"/>
+          <w:szCs w:val="20"/>
+        </w:rPr>
+        <w:t xml:space="preserve">Mantenerlas verticales y continuas; retirar 2" (50 mm) de tecnopor en la cara superior.</w:t>
+      </w:r>
+    </w:p>
+    <w:p>
+      <w:pPr>
+        <w:pStyle w:val="ListParagraph"/>
+        <w:numPr>
+          <w:ilvl w:val="0"/>
+          <w:numId w:val="2"/>
+        </w:numPr>
+        <w:spacing w:after="60" w:line="264"/>
+        <w:jc w:val="both"/>
+      </w:pPr>
+      <w:r>
+        <w:rPr>
+          <w:rFonts w:ascii="Arial" w:cs="Arial" w:eastAsia="Arial" w:hAnsi="Arial"/>
+          <w:sz w:val="20"/>
+          <w:szCs w:val="20"/>
+        </w:rPr>
+        <w:t xml:space="preserve">Calentar el RC-250, mezclarlo con arena gruesa y colocarlo compactando con tacos hasta el ras del piso.</w:t>
       </w:r>
     </w:p>
     <w:p>
@@ -21490,7 +21528,7 @@
           <w:sz w:val="20"/>
           <w:szCs w:val="20"/>
         </w:rPr>
-        <w:t xml:space="preserve">Junta continua en toda la longitud, sin contacto directo entre el concreto del colector y el del piso.</w:t>
+        <w:t xml:space="preserve">Junta continua en toda la longitud, sin contacto directo entre el concreto del colector y el cerco o el piso; sello compacto y al ras.</w:t>
       </w:r>
     </w:p>
     <w:p>
@@ -21531,6 +21569,25 @@
     </w:p>
     <w:p>
       <w:pPr>
+        <w:pStyle w:val="ListParagraph"/>
+        <w:numPr>
+          <w:ilvl w:val="0"/>
+          <w:numId w:val="2"/>
+        </w:numPr>
+        <w:spacing w:after="60" w:line="264"/>
+        <w:jc w:val="both"/>
+      </w:pPr>
+      <w:r>
+        <w:rPr>
+          <w:rFonts w:ascii="Arial" w:cs="Arial" w:eastAsia="Arial" w:hAnsi="Arial"/>
+          <w:sz w:val="20"/>
+          <w:szCs w:val="20"/>
+        </w:rPr>
+        <w:t xml:space="preserve">Calentar el asfalto lejos de materiales inflamables, con extintor a la mano.</w:t>
+      </w:r>
+    </w:p>
+    <w:p>
+      <w:pPr>
         <w:keepNext/>
         <w:spacing w:after="60" w:before="120"/>
       </w:pPr>
@@ -21588,7 +21645,7 @@
           <w:sz w:val="20"/>
           <w:szCs w:val="20"/>
         </w:rPr>
-        <w:t xml:space="preserve">Se medirá la longitud de junta colocada, a ambos lados del colector y en los contactos indicados en el metrado.</w:t>
+        <w:t xml:space="preserve">Se medirá la longitud de junta colocada y sellada en los contactos indicados en el metrado.</w:t>
       </w:r>
     </w:p>
     <w:p>

</xml_diff>

<commit_message>
Hogar de Refugio: tabla oficial CAPECO-FTCCP 2026 y junta longitudinal solo contra el cerco
- Hoja COSTO HORA HOMBRE 2026 con el desglose oficial CAPECO - FTCCP 2026 (Exp. 339-2025-MTPE/2.14-NC):
  28.95 / 22.68 / 20.54; todas las ACU leen de ella. PDF guardado en insumos/normas.
- 01.04.04.06.02: solo la junta longitudinal entre el muro del colector y el cimiento del cerco
  (0+000.00 a 0+058.81); al lado via hay terreno natural, sin junta: 134.89 -> 58.81 m.
  DD-03 con vista D nueva (seccion con la junta solo contra el cerco), DP-04, DP-08, DP-09, DA-03,
  especificaciones y memoria sin piso ni vereda al lado via. Se borra el esquema antiguo de juntas.

Co-Authored-By: Claude Opus 5.5 <noreply@anthropic.com>
Claude-Session: https://claude.ai/code/session_0142t8T16igb3VKxUPwnQPq6
</commit_message>
<xml_diff>
--- a/entregables/ESPECIFICACIONES_TECNICAS_DRENAJE_PLUVIAL_HOGAR_REFUGIO.docx
+++ b/entregables/ESPECIFICACIONES_TECNICAS_DRENAJE_PLUVIAL_HOGAR_REFUGIO.docx
@@ -19758,7 +19758,7 @@
           <w:sz w:val="20"/>
           <w:szCs w:val="20"/>
         </w:rPr>
-        <w:t xml:space="preserve">Comprende el acabado frotachado de la cara superior de la losa del colector pluvial frontal del Hogar de Refugio Temporal, que en el tramo de vereda sirve de piso peatonal, al nivel del piso terminado (+260.60).</w:t>
+        <w:t xml:space="preserve">Comprende el acabado frotachado de la cara superior de la losa del colector pluvial frontal del Hogar de Refugio Temporal, que queda a nivel del terreno terminado del frente (+260.60) y sirve de superficie de tránsito peatonal.</w:t>
       </w:r>
     </w:p>
     <w:p>
@@ -21365,7 +21365,7 @@
           <w:sz w:val="20"/>
           <w:szCs w:val="20"/>
         </w:rPr>
-        <w:t xml:space="preserve">Comprende la junta de 1" con plancha de poliestireno expandido (tecnopor) y sellador asfáltico entre el colector pluvial frontal del Hogar de Refugio Temporal y las estructuras vecinas: cimiento del cerco existente (plancha de 0.90 m de altura) y borde de la losa superior con el piso adyacente, solo del lado vía (plancha de 0.10 m; al lado predio esta el cerco), de modo que cada estructura trabaje en forma independiente. En la cara superior de la junta se coloca sellador asfáltico de 1" x 2" (asfalto líquido RC-250 + arena gruesa), según la lámina DD-03.</w:t>
+        <w:t xml:space="preserve">Comprende la junta longitudinal de 1" con plancha de poliestireno expandido (tecnopor) y sellador asfáltico entre el muro del colector pluvial frontal del Hogar de Refugio Temporal (lado predio) y el cimiento del cerco existente, en todo el tramo del colector pegado al cerco (0+000.00 a 0+058.81), con plancha de 0.90 m de altura, de modo que el colector y el cerco trabajen en forma independiente. En la cara superior de la junta se coloca sellador asfáltico de 1" x 2" (asfalto líquido RC-250 + arena gruesa), según la lámina DD-03. Al otro lado del colector (lado vía) hay terreno natural, sin vereda ni piso, y no lleva junta.</w:t>
       </w:r>
     </w:p>
     <w:p>
@@ -21401,7 +21401,7 @@
           <w:sz w:val="20"/>
           <w:szCs w:val="20"/>
         </w:rPr>
-        <w:t xml:space="preserve">Plancha de tecnopor de 1" (densidad 10 a 15 kg/m³) en tiras de 0.90 m y de 0.10 m de altura; asfalto líquido RC-250 (NTP 321.028); arena gruesa limpia y seca.</w:t>
+        <w:t xml:space="preserve">Plancha de tecnopor de 1" (densidad 10 a 15 kg/m³) en tiras de 0.90 m de altura; asfalto líquido RC-250 (NTP 321.028); arena gruesa limpia y seca.</w:t>
       </w:r>
     </w:p>
     <w:p>
@@ -21473,45 +21473,45 @@
           <w:sz w:val="20"/>
           <w:szCs w:val="20"/>
         </w:rPr>
-        <w:t xml:space="preserve">Pegar la plancha al cimiento del cerco antes de vaciar el muro del colector, y la tira de 0.10 m contra el borde de la losa, lado vía, antes de vaciar el piso adyacente.</w:t>
-      </w:r>
-    </w:p>
-    <w:p>
-      <w:pPr>
-        <w:pStyle w:val="ListParagraph"/>
-        <w:numPr>
-          <w:ilvl w:val="0"/>
-          <w:numId w:val="2"/>
-        </w:numPr>
-        <w:spacing w:after="60" w:line="264"/>
-        <w:jc w:val="both"/>
-      </w:pPr>
-      <w:r>
-        <w:rPr>
-          <w:rFonts w:ascii="Arial" w:cs="Arial" w:eastAsia="Arial" w:hAnsi="Arial"/>
-          <w:sz w:val="20"/>
-          <w:szCs w:val="20"/>
-        </w:rPr>
-        <w:t xml:space="preserve">Mantenerlas verticales y continuas; retirar 2" (50 mm) de tecnopor en la cara superior.</w:t>
-      </w:r>
-    </w:p>
-    <w:p>
-      <w:pPr>
-        <w:pStyle w:val="ListParagraph"/>
-        <w:numPr>
-          <w:ilvl w:val="0"/>
-          <w:numId w:val="2"/>
-        </w:numPr>
-        <w:spacing w:after="60" w:line="264"/>
-        <w:jc w:val="both"/>
-      </w:pPr>
-      <w:r>
-        <w:rPr>
-          <w:rFonts w:ascii="Arial" w:cs="Arial" w:eastAsia="Arial" w:hAnsi="Arial"/>
-          <w:sz w:val="20"/>
-          <w:szCs w:val="20"/>
-        </w:rPr>
-        <w:t xml:space="preserve">Calentar el RC-250, mezclarlo con arena gruesa y colocarlo compactando con tacos hasta el ras del piso.</w:t>
+        <w:t xml:space="preserve">Pegar la plancha al cimiento del cerco antes de vaciar el muro del colector, continua en todo el tramo pegado al cerco.</w:t>
+      </w:r>
+    </w:p>
+    <w:p>
+      <w:pPr>
+        <w:pStyle w:val="ListParagraph"/>
+        <w:numPr>
+          <w:ilvl w:val="0"/>
+          <w:numId w:val="2"/>
+        </w:numPr>
+        <w:spacing w:after="60" w:line="264"/>
+        <w:jc w:val="both"/>
+      </w:pPr>
+      <w:r>
+        <w:rPr>
+          <w:rFonts w:ascii="Arial" w:cs="Arial" w:eastAsia="Arial" w:hAnsi="Arial"/>
+          <w:sz w:val="20"/>
+          <w:szCs w:val="20"/>
+        </w:rPr>
+        <w:t xml:space="preserve">Mantenerla vertical y continua; retirar 2" (50 mm) de tecnopor en la cara superior.</w:t>
+      </w:r>
+    </w:p>
+    <w:p>
+      <w:pPr>
+        <w:pStyle w:val="ListParagraph"/>
+        <w:numPr>
+          <w:ilvl w:val="0"/>
+          <w:numId w:val="2"/>
+        </w:numPr>
+        <w:spacing w:after="60" w:line="264"/>
+        <w:jc w:val="both"/>
+      </w:pPr>
+      <w:r>
+        <w:rPr>
+          <w:rFonts w:ascii="Arial" w:cs="Arial" w:eastAsia="Arial" w:hAnsi="Arial"/>
+          <w:sz w:val="20"/>
+          <w:szCs w:val="20"/>
+        </w:rPr>
+        <w:t xml:space="preserve">Calentar el RC-250, mezclarlo con arena gruesa y colocarlo compactando con tacos hasta el ras.</w:t>
       </w:r>
     </w:p>
     <w:p>
@@ -21547,7 +21547,7 @@
           <w:sz w:val="20"/>
           <w:szCs w:val="20"/>
         </w:rPr>
-        <w:t xml:space="preserve">Junta continua en toda la longitud, sin contacto directo entre el concreto del colector y el cerco o el piso; sello compacto y al ras.</w:t>
+        <w:t xml:space="preserve">Junta continua en toda su longitud, sin contacto directo entre el concreto del colector y el cimiento del cerco; sello compacto y al ras.</w:t>
       </w:r>
     </w:p>
     <w:p>
@@ -21664,7 +21664,7 @@
           <w:sz w:val="20"/>
           <w:szCs w:val="20"/>
         </w:rPr>
-        <w:t xml:space="preserve">Se medirá la longitud de junta colocada y sellada: contra el cimiento del cerco en el tramo pegado al cerco y en el borde de la losa solo del lado vía (colector y cajas CL y CC), como en el metrado.</w:t>
+        <w:t xml:space="preserve">Se medirá la longitud de junta longitudinal colocada y sellada contra el cimiento del cerco, en el tramo pegado al cerco, como en el metrado.</w:t>
       </w:r>
     </w:p>
     <w:p>

</xml_diff>

<commit_message>
Hogar de Refugio: laminas DJ-02 (proceso constructivo de la junta de cunetas en isometrico 3D) y DJ-03 (rejilla movil)
- DJ-02: 4 etapas en isometrico a 1/10 (vaciado del pano 1, plancha de tecnopor en U, acero y
  vaciado del pano 2, sellado asfaltico y rejilla con corte parcial del muro).
- DJ-03: rejilla de la partida 01.04.03.04.03.01 segun la seccion del plano de arquitectura:
  modulo de 1.00 x 0.497 m en el rebaje de 0.05 x 1", 39 platinas 1" x 3/16" @1" y 2 angulos
  L 1" x 1" x 3/16" (20.0 kg/m); isometricos, planta, seccion, corte B-B, despiece y notas.
- DJ-01 a DJ-03 en un solo DXF con vistas previas; especificaciones enlazadas a las laminas.

Co-Authored-By: Claude Opus 5.5 <noreply@anthropic.com>
Claude-Session: https://claude.ai/code/session_0142t8T16igb3VKxUPwnQPq6
</commit_message>
<xml_diff>
--- a/entregables/ESPECIFICACIONES_TECNICAS_DRENAJE_PLUVIAL_HOGAR_REFUGIO.docx
+++ b/entregables/ESPECIFICACIONES_TECNICAS_DRENAJE_PLUVIAL_HOGAR_REFUGIO.docx
@@ -8029,7 +8029,7 @@
           <w:sz w:val="20"/>
           <w:szCs w:val="20"/>
         </w:rPr>
-        <w:t xml:space="preserve">Separación de las platinas: 1" (0.025 m) entre ejes, con abertura libre de 0.02 m, según la proporción del detalle de rejilla (dibujado sin escala: la separación entre platinas es igual al ala de 1" del ángulo del marco). El ancho del módulo será el ancho interior de la cuneta (0.40 m) más el apoyo en el rebaje de 0.05 m de cada borde.</w:t>
+        <w:t xml:space="preserve">Según la lámina DJ-03: cada módulo de 1.00 m (0.997 m fabricado, 3 mm de holgura entre módulos) tiene 2 ángulos L 1" x 1" x 3/16" con el ala horizontal apoyada en el rebaje y el ala vertical hacia la cuneta, y 39 platinas de 1" x 3/16" x 0.446 m de canto @1" entre ejes (abertura libre 0.021 m), soldadas a tope al ala vertical. El módulo mide 0.497 m de ancho y se apoya en el rebaje de 0.05 x 1" del borde interior de cada muro, a ras del borde superior de la cuneta; pesa 20.0 kg por metro.</w:t>
       </w:r>
     </w:p>
     <w:p>
@@ -8859,7 +8859,7 @@
           <w:sz w:val="20"/>
           <w:szCs w:val="20"/>
         </w:rPr>
-        <w:t xml:space="preserve">Comprende las juntas de dilatación de 1" (0.0254 m) de las cunetas, cada 3.00 m y en los cambios de dirección, en toda la sección en U: los dos muros y la losa de fondo, de modo que cada tramo entre juntas trabaje independiente, según la EG-2013 MTC, Sección 510 (cunetas revestidas de concreto). La junta lleva plancha de tecnopor de 1" en todo el espesor y sellador asfáltico (asfalto líquido RC-250 + arena gruesa) en la cara interior, según la lámina DJ-01.</w:t>
+        <w:t xml:space="preserve">Comprende las juntas de dilatación de 1" (0.0254 m) de las cunetas, cada 3.00 m y en los cambios de dirección, en toda la sección en U: los dos muros y la losa de fondo, de modo que cada tramo entre juntas trabaje independiente, según la EG-2013 MTC, Sección 510 (cunetas revestidas de concreto). La junta lleva plancha de tecnopor de 1" en todo el espesor y sellador asfáltico (asfalto líquido RC-250 + arena gruesa) en la cara interior, según las láminas DJ-01 y DJ-02.</w:t>
       </w:r>
     </w:p>
     <w:p>

</xml_diff>

<commit_message>
Hogar de Refugio: la losa superior del colector sirve de vereda (memoria, especificaciones, DD-03, DP-04, DA-01 a DA-03, DP-09)
Al lado via hay terreno natural sin junta; la losa del colector es la vereda. Partida
01.04.04.04.04 ACABADO FROTACHADO DE LOSA SUPERIOR (VEREDA) sin cambio.

Co-Authored-By: Claude Opus 5.5 <noreply@anthropic.com>
Claude-Session: https://claude.ai/code/session_0142t8T16igb3VKxUPwnQPq6
</commit_message>
<xml_diff>
--- a/entregables/ESPECIFICACIONES_TECNICAS_DRENAJE_PLUVIAL_HOGAR_REFUGIO.docx
+++ b/entregables/ESPECIFICACIONES_TECNICAS_DRENAJE_PLUVIAL_HOGAR_REFUGIO.docx
@@ -19758,7 +19758,7 @@
           <w:sz w:val="20"/>
           <w:szCs w:val="20"/>
         </w:rPr>
-        <w:t xml:space="preserve">Comprende el acabado frotachado de la cara superior de la losa del colector pluvial frontal del Hogar de Refugio Temporal, que queda a nivel del terreno terminado del frente (+260.60) y sirve de superficie de tránsito peatonal.</w:t>
+        <w:t xml:space="preserve">Comprende el acabado frotachado de la cara superior de la losa del colector pluvial frontal del Hogar de Refugio Temporal, que sirve de vereda peatonal, a nivel del terreno terminado del frente (+260.60).</w:t>
       </w:r>
     </w:p>
     <w:p>
@@ -21365,7 +21365,7 @@
           <w:sz w:val="20"/>
           <w:szCs w:val="20"/>
         </w:rPr>
-        <w:t xml:space="preserve">Comprende la junta longitudinal de 1" con plancha de poliestireno expandido (tecnopor) y sellador asfáltico entre el muro del colector pluvial frontal del Hogar de Refugio Temporal (lado predio) y el cimiento del cerco existente, en todo el tramo del colector pegado al cerco (0+000.00 a 0+058.81), con plancha de 0.90 m de altura, de modo que el colector y el cerco trabajen en forma independiente. En la cara superior de la junta se coloca sellador asfáltico de 1" x 2" (asfalto líquido RC-250 + arena gruesa), según la lámina DD-03. Al otro lado del colector (lado vía) hay terreno natural, sin vereda ni piso, y no lleva junta.</w:t>
+        <w:t xml:space="preserve">Comprende la junta longitudinal de 1" con plancha de poliestireno expandido (tecnopor) y sellador asfáltico entre el muro del colector pluvial frontal del Hogar de Refugio Temporal (lado predio) y el cimiento del cerco existente, en todo el tramo del colector pegado al cerco (0+000.00 a 0+058.81), con plancha de 0.90 m de altura, de modo que el colector y el cerco trabajen en forma independiente. En la cara superior de la junta se coloca sellador asfáltico de 1" x 2" (asfalto líquido RC-250 + arena gruesa), según la lámina DD-03. Al otro lado del colector (lado vía) hay terreno natural y no lleva junta; la losa superior del colector sirve de vereda.</w:t>
       </w:r>
     </w:p>
     <w:p>

</xml_diff>

<commit_message>
Tapa ciega de concreto armado en los 3 CAR: DP-06B, DD-01, DD-02, isometricos, metrado de Refugio y Varones
- Tapa ciega 0.68x0.68x0.08 vaciada aparte en obra, parrilla 3/8" @0.10 y 2 asas de fierro liso 1/2" en cajuelas, sin marco ni contramarco metalico; asiento en rebaje de concreto 0.70x0.70x0.08 de la losa (luz libre 0.60).
- DP-06B nuevo para Hogar de Refugio (CUI 2675514), CAR Varones (CUI 2705619) y CAR Mujeres (CUI 2717013), sueltos y dentro de cada juego de planos, con vistas previas.
- Metrado y ACU de la tapa actualizados solo en Refugio y Varones; el metrado de CAR Mujeres no se toca.
- DD-01, DD-02, DP-06D, DP-08, DP-09, DA-03, especificaciones y memorias coherentes con la tapa ciega.

Co-Authored-By: Claude Opus 5.5 <noreply@anthropic.com>
Claude-Session: https://claude.ai/code/session_0142t8T16igb3VKxUPwnQPq6
</commit_message>
<xml_diff>
--- a/entregables/ESPECIFICACIONES_TECNICAS_DRENAJE_PLUVIAL_HOGAR_REFUGIO.docx
+++ b/entregables/ESPECIFICACIONES_TECNICAS_DRENAJE_PLUVIAL_HOGAR_REFUGIO.docx
@@ -20476,7 +20476,7 @@
         <w:keepNext/>
       </w:pPr>
       <w:r>
-        <w:t xml:space="preserve">01.04.04.05.01  TAPA DE REGISTRO 0.68x0.68 C/MARCO Y CONTRAMARCO  (und)</w:t>
+        <w:t xml:space="preserve">01.04.04.05.01  TAPA DE REGISTRO CIEGA DE CONCRETO ARMADO 0.68x0.68x0.08  (und)</w:t>
       </w:r>
     </w:p>
     <w:p>
@@ -20507,7 +20507,7 @@
           <w:sz w:val="20"/>
           <w:szCs w:val="20"/>
         </w:rPr>
-        <w:t xml:space="preserve">Comprende el registro de limpieza completo del colector pluvial frontal del Hogar de Refugio Temporal: contramarco de ángulo L 1 1/2" x 1 1/2" x 1/8" de 0.70 x 0.70 m con 8 anclajes de 3/8" embutido en la abertura de la losa, borde engrosado de 0.15 x 0.10 m bajo la losa con refuerzo de 2 barras de 1/2" por lado, y tapa de concreto armado f'c = 210 kg/cm² de 0.68 x 0.68 x 0.08 m con marco de ángulo L 1 1/2" x 1 1/2" x 1/8", parrilla de 7 + 7 barras de 3/8" @0.10 m y dos asas de 3/8" liso, todo según la lámina DP-06B.</w:t>
+        <w:t xml:space="preserve">Comprende el registro de limpieza completo del colector pluvial frontal del Hogar de Refugio Temporal con tapa CIEGA de concreto armado, sin marco ni contramarco metálico: rebaje de 0.70 x 0.70 x 0.08 m formado en la losa superior como asiento de la tapa (0.05 m por lado), luz libre de 0.60 x 0.60 m, borde engrosado de 0.15 x 0.10 m bajo la losa con refuerzo de borde de 2 barras de 1/2" por lado (L = 1.40 m), y tapa de concreto armado f'c = 210 kg/cm² de 0.68 x 0.68 x 0.08 m vaciada aparte en obra, con parrilla de 7 + 7 barras de 3/8" @0.10 m, dos asas de fierro liso de 1/2" (0.50 m) en cajuelas de 0.19 x 0.06 x 0.03 m y cantos biselados de 1 x 1 cm, todo según las láminas DP-06B, DP-06D, DD-01 y DD-02.</w:t>
       </w:r>
     </w:p>
     <w:p>
@@ -20557,7 +20557,7 @@
           <w:sz w:val="20"/>
           <w:szCs w:val="20"/>
         </w:rPr>
-        <w:t xml:space="preserve">Ángulos A36; concreto f'c = 210 kg/cm²; acero corrugado grado 60 de 3/8" y 1/2"; acero liso de 3/8"; soldadura E6011; pintura anticorrosiva y esmalte.</w:t>
+        <w:t xml:space="preserve">Concreto f'c = 210 kg/cm²; acero corrugado grado 60 de 3/8" y 1/2"; fierro liso de 1/2" (A36) para las asas; alambre negro N.° 16; madera para el molde y el cajón del rebaje; desmoldante.</w:t>
       </w:r>
     </w:p>
     <w:p>
@@ -20593,7 +20593,7 @@
           <w:sz w:val="20"/>
           <w:szCs w:val="20"/>
         </w:rPr>
-        <w:t xml:space="preserve">Máquina de soldar, amoladora, mezcladora o mezclado en batea, vibrador, herramientas de carpintería.</w:t>
+        <w:t xml:space="preserve">Mezcladora o mezclado en batea, vibrador, herramientas de carpintería, cizalla y dobladora de fierro.</w:t>
       </w:r>
     </w:p>
     <w:p>
@@ -20629,83 +20629,83 @@
           <w:sz w:val="20"/>
           <w:szCs w:val="20"/>
         </w:rPr>
-        <w:t xml:space="preserve">Fabricar el contramarco y colocarlo con el encofrado de la losa, nivelado, con su ala a 0.08 m bajo el piso terminado, amarrado al refuerzo de borde.</w:t>
-      </w:r>
-    </w:p>
-    <w:p>
-      <w:pPr>
-        <w:pStyle w:val="ListParagraph"/>
-        <w:numPr>
-          <w:ilvl w:val="0"/>
-          <w:numId w:val="2"/>
-        </w:numPr>
-        <w:spacing w:after="60" w:line="264"/>
-        <w:jc w:val="both"/>
-      </w:pPr>
-      <w:r>
-        <w:rPr>
-          <w:rFonts w:ascii="Arial" w:cs="Arial" w:eastAsia="Arial" w:hAnsi="Arial"/>
-          <w:sz w:val="20"/>
-          <w:szCs w:val="20"/>
-        </w:rPr>
-        <w:t xml:space="preserve">Fabricar el marco de la tapa y soldar a el la parrilla; colocar las asas en sus cajuelas (molde de 0.18 x 0.06 x 0.03 m) para que no sobresalgan.</w:t>
-      </w:r>
-    </w:p>
-    <w:p>
-      <w:pPr>
-        <w:pStyle w:val="ListParagraph"/>
-        <w:numPr>
-          <w:ilvl w:val="0"/>
-          <w:numId w:val="2"/>
-        </w:numPr>
-        <w:spacing w:after="60" w:line="264"/>
-        <w:jc w:val="both"/>
-      </w:pPr>
-      <w:r>
-        <w:rPr>
-          <w:rFonts w:ascii="Arial" w:cs="Arial" w:eastAsia="Arial" w:hAnsi="Arial"/>
-          <w:sz w:val="20"/>
-          <w:szCs w:val="20"/>
-        </w:rPr>
-        <w:t xml:space="preserve">Vaciar la tapa sobre un tablero plano, vibrar y frotachar; curar 7 días.</w:t>
-      </w:r>
-    </w:p>
-    <w:p>
-      <w:pPr>
-        <w:pStyle w:val="ListParagraph"/>
-        <w:numPr>
-          <w:ilvl w:val="0"/>
-          <w:numId w:val="2"/>
-        </w:numPr>
-        <w:spacing w:after="60" w:line="264"/>
-        <w:jc w:val="both"/>
-      </w:pPr>
-      <w:r>
-        <w:rPr>
-          <w:rFonts w:ascii="Arial" w:cs="Arial" w:eastAsia="Arial" w:hAnsi="Arial"/>
-          <w:sz w:val="20"/>
-          <w:szCs w:val="20"/>
-        </w:rPr>
-        <w:t xml:space="preserve">Pintar los ángulos con dos manos de anticorrosivo y dos de esmalte.</w:t>
-      </w:r>
-    </w:p>
-    <w:p>
-      <w:pPr>
-        <w:pStyle w:val="ListParagraph"/>
-        <w:numPr>
-          <w:ilvl w:val="0"/>
-          <w:numId w:val="2"/>
-        </w:numPr>
-        <w:spacing w:after="60" w:line="264"/>
-        <w:jc w:val="both"/>
-      </w:pPr>
-      <w:r>
-        <w:rPr>
-          <w:rFonts w:ascii="Arial" w:cs="Arial" w:eastAsia="Arial" w:hAnsi="Arial"/>
-          <w:sz w:val="20"/>
-          <w:szCs w:val="20"/>
-        </w:rPr>
-        <w:t xml:space="preserve">Colocar la tapa sobre el contramarco con holgura de 1 cm por lado; debe asentar en todo su perímetro, al ras del piso, y retirarse con dos operarios usando las asas.</w:t>
+        <w:t xml:space="preserve">Formar el rebaje y la luz libre de la losa con un cajón de madera de dos niveles (0.70 x 0.70 x 0.08 y 0.60 x 0.60 x 0.12) fijado al encofrado antes del vaciado, a nivel del piso terminado, con el refuerzo de borde amarrado.</w:t>
+      </w:r>
+    </w:p>
+    <w:p>
+      <w:pPr>
+        <w:pStyle w:val="ListParagraph"/>
+        <w:numPr>
+          <w:ilvl w:val="0"/>
+          <w:numId w:val="2"/>
+        </w:numPr>
+        <w:spacing w:after="60" w:line="264"/>
+        <w:jc w:val="both"/>
+      </w:pPr>
+      <w:r>
+        <w:rPr>
+          <w:rFonts w:ascii="Arial" w:cs="Arial" w:eastAsia="Arial" w:hAnsi="Arial"/>
+          <w:sz w:val="20"/>
+          <w:szCs w:val="20"/>
+        </w:rPr>
+        <w:t xml:space="preserve">Vaciar la losa; dejar el asiento del rebaje plano y nivelado; retirar el cajón a las 24 horas y curar 7 días.</w:t>
+      </w:r>
+    </w:p>
+    <w:p>
+      <w:pPr>
+        <w:pStyle w:val="ListParagraph"/>
+        <w:numPr>
+          <w:ilvl w:val="0"/>
+          <w:numId w:val="2"/>
+        </w:numPr>
+        <w:spacing w:after="60" w:line="264"/>
+        <w:jc w:val="both"/>
+      </w:pPr>
+      <w:r>
+        <w:rPr>
+          <w:rFonts w:ascii="Arial" w:cs="Arial" w:eastAsia="Arial" w:hAnsi="Arial"/>
+          <w:sz w:val="20"/>
+          <w:szCs w:val="20"/>
+        </w:rPr>
+        <w:t xml:space="preserve">Fabricar la tapa aparte en obra, sobre un tablero nivelado y con molde lateral de madera de 0.68 x 0.68 x 0.08 m con tiras de chaflán; colocar la parrilla con recubrimiento de 2.5 cm y las asas amarradas a ella, con tacos para las cajuelas.</w:t>
+      </w:r>
+    </w:p>
+    <w:p>
+      <w:pPr>
+        <w:pStyle w:val="ListParagraph"/>
+        <w:numPr>
+          <w:ilvl w:val="0"/>
+          <w:numId w:val="2"/>
+        </w:numPr>
+        <w:spacing w:after="60" w:line="264"/>
+        <w:jc w:val="both"/>
+      </w:pPr>
+      <w:r>
+        <w:rPr>
+          <w:rFonts w:ascii="Arial" w:cs="Arial" w:eastAsia="Arial" w:hAnsi="Arial"/>
+          <w:sz w:val="20"/>
+          <w:szCs w:val="20"/>
+        </w:rPr>
+        <w:t xml:space="preserve">Vaciar, vibrar y frotachar la tapa; desmoldar a las 24 horas y curar 7 días. No se suelda ni se pinta: la tapa no lleva elementos metálicos a la vista.</w:t>
+      </w:r>
+    </w:p>
+    <w:p>
+      <w:pPr>
+        <w:pStyle w:val="ListParagraph"/>
+        <w:numPr>
+          <w:ilvl w:val="0"/>
+          <w:numId w:val="2"/>
+        </w:numPr>
+        <w:spacing w:after="60" w:line="264"/>
+        <w:jc w:val="both"/>
+      </w:pPr>
+      <w:r>
+        <w:rPr>
+          <w:rFonts w:ascii="Arial" w:cs="Arial" w:eastAsia="Arial" w:hAnsi="Arial"/>
+          <w:sz w:val="20"/>
+          <w:szCs w:val="20"/>
+        </w:rPr>
+        <w:t xml:space="preserve">Colocar la tapa en el rebaje con dos operarios usando las asas: holgura de 1 cm por lado, al ras del piso terminado y sin mortero (removible).</w:t>
       </w:r>
     </w:p>
     <w:p>
@@ -20741,7 +20741,7 @@
           <w:sz w:val="20"/>
           <w:szCs w:val="20"/>
         </w:rPr>
-        <w:t xml:space="preserve">Medidas ±2 mm; tapa sin cojeo ni fisuras; ras con el piso ±3 mm.</w:t>
+        <w:t xml:space="preserve">Rebaje 0.70 x 0.70 m ±5 mm y asiento nivelado; tapa 0.68 x 0.68 x 0.08 m ±2 mm, sin cojeo ni fisuras; ras con el piso ±3 mm.</w:t>
       </w:r>
     </w:p>
     <w:p>
@@ -20796,26 +20796,7 @@
           <w:sz w:val="20"/>
           <w:szCs w:val="20"/>
         </w:rPr>
-        <w:t xml:space="preserve">Careta de soldar con filtro adecuado, guantes y mandil de cuero; pantallas que protejan al personal vecino.</w:t>
-      </w:r>
-    </w:p>
-    <w:p>
-      <w:pPr>
-        <w:pStyle w:val="ListParagraph"/>
-        <w:numPr>
-          <w:ilvl w:val="0"/>
-          <w:numId w:val="2"/>
-        </w:numPr>
-        <w:spacing w:after="60" w:line="264"/>
-        <w:jc w:val="both"/>
-      </w:pPr>
-      <w:r>
-        <w:rPr>
-          <w:rFonts w:ascii="Arial" w:cs="Arial" w:eastAsia="Arial" w:hAnsi="Arial"/>
-          <w:sz w:val="20"/>
-          <w:szCs w:val="20"/>
-        </w:rPr>
-        <w:t xml:space="preserve">Equipo de soldar con puesta a tierra; extintor de PQS a la mano; prohibido soldar cerca de materiales inflamables.</w:t>
+        <w:t xml:space="preserve">Izaje de la tapa (aprox. 89 kg) entre dos operarios con ganchos; no levantar con las manos por los cantos.</w:t>
       </w:r>
     </w:p>
     <w:p>
@@ -20877,7 +20858,7 @@
           <w:sz w:val="20"/>
           <w:szCs w:val="20"/>
         </w:rPr>
-        <w:t xml:space="preserve">Se contará el número de registros (tapas con su marco y contramarco) terminados y aprobados.</w:t>
+        <w:t xml:space="preserve">Se contará el número de registros (tapas ciegas colocadas en su rebaje) terminados y aprobados.</w:t>
       </w:r>
     </w:p>
     <w:p>

</xml_diff>

<commit_message>
Hogar de Refugio: especificaciones tecnicas con el metrado vigente (bancas OC-01) y laminas DPL
Co-Authored-By: Claude Opus 5.5 <noreply@anthropic.com>
Claude-Session: https://claude.ai/code/session_0142t8T16igb3VKxUPwnQPq6
</commit_message>
<xml_diff>
--- a/entregables/ESPECIFICACIONES_TECNICAS_DRENAJE_PLUVIAL_HOGAR_REFUGIO.docx
+++ b/entregables/ESPECIFICACIONES_TECNICAS_DRENAJE_PLUVIAL_HOGAR_REFUGIO.docx
@@ -109,7 +109,7 @@
           <w:sz w:val="22"/>
           <w:szCs w:val="22"/>
         </w:rPr>
-        <w:t xml:space="preserve">CREACIÓN DEL SERVICIO DE PROTECCIÓN A MUJERES VÍCTIMAS DE VIOLENCIA EN SITUACIÓN DE RIESGO DE FEMINICIDIO O PELIGRE SU INTEGRIDAD Y/O SALUD FÍSICA Y/O MENTAL EN HOGAR DE REFUGIO TEMPORAL DISTRITO DE MORALES DE LA PROVINCIA DE SAN MARTÍN DEL DEPARTAMENTO DE SAN MARTÍN”, con CUI N.° 2675514</w:t>
+        <w:t xml:space="preserve">CREACIÓN DEL SERVICIO DE PROTECCIÓN A MUJERES VÍCTIMAS DE VIOLENCIA EN SITUACIÓN DE RIESGO DE FEMINICIDIO O PELIGRE SU INTEGRIDAD Y/O SALUD FÍSICA Y/O MENTAL EN HOGAR DE REFUGIO TEMPORAL DISTRITO DE MORALES DE LA PROVINCIA DE SAN MARTÍN DEL DEPARTAMENTO DE SAN MARTÍN</w:t>
       </w:r>
     </w:p>
     <w:p>
@@ -234,7 +234,7 @@
           <w:sz w:val="20"/>
           <w:szCs w:val="20"/>
         </w:rPr>
-        <w:t xml:space="preserve">Las presentes especificaciones técnicas definen la calidad de los materiales, los procedimientos de ejecución, los controles, la seguridad, la unidad de medida, el método de medición y la forma de pago de cada partida de la especialidad de drenaje pluvial del proyecto CREACIÓN DEL SERVICIO DE PROTECCIÓN A MUJERES VÍCTIMAS DE VIOLENCIA EN SITUACIÓN DE RIESGO DE FEMINICIDIO O PELIGRE SU INTEGRIDAD Y/O SALUD FÍSICA Y/O MENTAL EN HOGAR DE REFUGIO TEMPORAL DISTRITO DE MORALES DE LA PROVINCIA DE SAN MARTÍN DEL DEPARTAMENTO DE SAN MARTÍN”, con CUI N.° 2675514, con CUI N.° 2675514.</w:t>
+        <w:t xml:space="preserve">Las presentes especificaciones técnicas definen la calidad de los materiales, los procedimientos de ejecución, los controles, la seguridad, la unidad de medida, el método de medición y la forma de pago de cada partida de la especialidad de drenaje pluvial del proyecto CREACIÓN DEL SERVICIO DE PROTECCIÓN A MUJERES VÍCTIMAS DE VIOLENCIA EN SITUACIÓN DE RIESGO DE FEMINICIDIO O PELIGRE SU INTEGRIDAD Y/O SALUD FÍSICA Y/O MENTAL EN HOGAR DE REFUGIO TEMPORAL DISTRITO DE MORALES DE LA PROVINCIA DE SAN MARTÍN DEL DEPARTAMENTO DE SAN MARTÍN, con CUI N.° 2675514.</w:t>
       </w:r>
     </w:p>
     <w:p>
@@ -248,7 +248,7 @@
           <w:sz w:val="20"/>
           <w:szCs w:val="20"/>
         </w:rPr>
-        <w:t xml:space="preserve">Comprenden el sistema de drenaje pluvial del predio (cunetas de concreto armado con rejillas y tapas, montantes y canaletas de techo, red de recolección de piso con sumideros) y el colector pluvial frontal del Hogar de Refugio Temporal, que recorre el frente del predio y entrega a el registro R-01 del colector del CAR Mujeres (CUI 2717013), a través de la caja de caída CC con poza de disipación.</w:t>
+        <w:t xml:space="preserve">Comprenden el sistema de drenaje pluvial del predio (cunetas de concreto armado con rejillas y tapas, montantes y canaletas de techo, red de recolección de piso con sumideros, lloraderos en las cunetas colindantes con área verde y canaletas de los techos de las bancas con pérgola OC-01) y el colector pluvial frontal del Hogar de Refugio Temporal, que recorre el frente del predio y entrega a el registro R-01 del colector del CAR Mujeres (CUI 2717013), a través de la caja de caída CC con poza de disipación.</w:t>
       </w:r>
     </w:p>
     <w:p>
@@ -15658,6 +15658,1571 @@
     </w:p>
     <w:p>
       <w:pPr>
+        <w:pStyle w:val="Heading4"/>
+        <w:keepNext/>
+      </w:pPr>
+      <w:r>
+        <w:t xml:space="preserve">01.04.03.05.04  RED DE RECOLECCION TECHO DE BANCAS CON PERGOLA (OC-01)</w:t>
+      </w:r>
+    </w:p>
+    <w:p>
+      <w:pPr>
+        <w:pStyle w:val="Heading5"/>
+        <w:keepNext/>
+      </w:pPr>
+      <w:r>
+        <w:t xml:space="preserve">01.04.03.05.04.01  CANALETA DE PLANCHA DE ACERO GALVANIZADO e=0.50mm, SECCIÓN 0.18m x 0.21m  (m)</w:t>
+      </w:r>
+    </w:p>
+    <w:p>
+      <w:pPr>
+        <w:keepNext/>
+        <w:spacing w:after="60" w:before="120"/>
+      </w:pPr>
+      <w:r>
+        <w:rPr>
+          <w:rFonts w:ascii="Arial" w:cs="Arial" w:eastAsia="Arial" w:hAnsi="Arial"/>
+          <w:b/>
+          <w:bCs/>
+          <w:color w:val="1F3864"/>
+          <w:sz w:val="19"/>
+          <w:szCs w:val="19"/>
+        </w:rPr>
+        <w:t xml:space="preserve">DESCRIPCIÓN</w:t>
+      </w:r>
+    </w:p>
+    <w:p>
+      <w:pPr>
+        <w:spacing w:after="100" w:before="0" w:line="276"/>
+        <w:jc w:val="both"/>
+      </w:pPr>
+      <w:r>
+        <w:rPr>
+          <w:rFonts w:ascii="Arial" w:cs="Arial" w:eastAsia="Arial" w:hAnsi="Arial"/>
+          <w:sz w:val="20"/>
+          <w:szCs w:val="20"/>
+        </w:rPr>
+        <w:t xml:space="preserve">Comprende la fabricación y colocación de la canaleta de plancha de acero galvanizado de e = 0.50 mm, de sección interior 0.18 m de ancho x 0.21 m de alto, con ala posterior de 0.10 m apoyada sobre la viga metálica de la pérgola bajo la cobertura de aluzinc, en el borde bajo de cada uno de los nueve techos de las bancas con pérgola (tres juegos OC-01 de tres techos: 3.79, 4.21 y 3.79 m). Cada techo lleva un solo tramo de canaleta, sin uniones, con pendiente de 0.5 % hacia su boquilla, según las láminas DPL-41 y DPL-42.</w:t>
+      </w:r>
+    </w:p>
+    <w:p>
+      <w:pPr>
+        <w:keepNext/>
+        <w:spacing w:after="60" w:before="120"/>
+      </w:pPr>
+      <w:r>
+        <w:rPr>
+          <w:rFonts w:ascii="Arial" w:cs="Arial" w:eastAsia="Arial" w:hAnsi="Arial"/>
+          <w:b/>
+          <w:bCs/>
+          <w:color w:val="1F3864"/>
+          <w:sz w:val="19"/>
+          <w:szCs w:val="19"/>
+        </w:rPr>
+        <w:t xml:space="preserve">MATERIALES</w:t>
+      </w:r>
+    </w:p>
+    <w:p>
+      <w:pPr>
+        <w:pStyle w:val="ListParagraph"/>
+        <w:numPr>
+          <w:ilvl w:val="0"/>
+          <w:numId w:val="2"/>
+        </w:numPr>
+        <w:spacing w:after="60" w:line="264"/>
+        <w:jc w:val="both"/>
+      </w:pPr>
+      <w:r>
+        <w:rPr>
+          <w:rFonts w:ascii="Arial" w:cs="Arial" w:eastAsia="Arial" w:hAnsi="Arial"/>
+          <w:sz w:val="20"/>
+          <w:szCs w:val="20"/>
+        </w:rPr>
+        <w:t xml:space="preserve">Plancha de acero galvanizado de 0.50 mm (ASTM A653, recubrimiento G90), desarrollo de 0.70 m por metro de canaleta (fondo 0.18 + lados 0.21 + 0.21 + ala 0.10); remaches pop de 1/8"; sellador de poliuretano.</w:t>
+      </w:r>
+    </w:p>
+    <w:p>
+      <w:pPr>
+        <w:keepNext/>
+        <w:spacing w:after="60" w:before="120"/>
+      </w:pPr>
+      <w:r>
+        <w:rPr>
+          <w:rFonts w:ascii="Arial" w:cs="Arial" w:eastAsia="Arial" w:hAnsi="Arial"/>
+          <w:b/>
+          <w:bCs/>
+          <w:color w:val="1F3864"/>
+          <w:sz w:val="19"/>
+          <w:szCs w:val="19"/>
+        </w:rPr>
+        <w:t xml:space="preserve">EQUIPOS Y HERRAMIENTAS</w:t>
+      </w:r>
+    </w:p>
+    <w:p>
+      <w:pPr>
+        <w:pStyle w:val="ListParagraph"/>
+        <w:numPr>
+          <w:ilvl w:val="0"/>
+          <w:numId w:val="2"/>
+        </w:numPr>
+        <w:spacing w:after="60" w:line="264"/>
+        <w:jc w:val="both"/>
+      </w:pPr>
+      <w:r>
+        <w:rPr>
+          <w:rFonts w:ascii="Arial" w:cs="Arial" w:eastAsia="Arial" w:hAnsi="Arial"/>
+          <w:sz w:val="20"/>
+          <w:szCs w:val="20"/>
+        </w:rPr>
+        <w:t xml:space="preserve">Dobladora de plancha, tijera de hojalatero, remachadora, taladro, escalera o andamio, nivel de mano y cordel.</w:t>
+      </w:r>
+    </w:p>
+    <w:p>
+      <w:pPr>
+        <w:keepNext/>
+        <w:spacing w:after="60" w:before="120"/>
+      </w:pPr>
+      <w:r>
+        <w:rPr>
+          <w:rFonts w:ascii="Arial" w:cs="Arial" w:eastAsia="Arial" w:hAnsi="Arial"/>
+          <w:b/>
+          <w:bCs/>
+          <w:color w:val="1F3864"/>
+          <w:sz w:val="19"/>
+          <w:szCs w:val="19"/>
+        </w:rPr>
+        <w:t xml:space="preserve">PROCEDIMIENTO DE EJECUCIÓN</w:t>
+      </w:r>
+    </w:p>
+    <w:p>
+      <w:pPr>
+        <w:pStyle w:val="ListParagraph"/>
+        <w:numPr>
+          <w:ilvl w:val="0"/>
+          <w:numId w:val="2"/>
+        </w:numPr>
+        <w:spacing w:after="60" w:line="264"/>
+        <w:jc w:val="both"/>
+      </w:pPr>
+      <w:r>
+        <w:rPr>
+          <w:rFonts w:ascii="Arial" w:cs="Arial" w:eastAsia="Arial" w:hAnsi="Arial"/>
+          <w:sz w:val="20"/>
+          <w:szCs w:val="20"/>
+        </w:rPr>
+        <w:t xml:space="preserve">Verificar en obra el largo de cada techo y el punto de salida de la lámina DPL-41.</w:t>
+      </w:r>
+    </w:p>
+    <w:p>
+      <w:pPr>
+        <w:pStyle w:val="ListParagraph"/>
+        <w:numPr>
+          <w:ilvl w:val="0"/>
+          <w:numId w:val="2"/>
+        </w:numPr>
+        <w:spacing w:after="60" w:line="264"/>
+        <w:jc w:val="both"/>
+      </w:pPr>
+      <w:r>
+        <w:rPr>
+          <w:rFonts w:ascii="Arial" w:cs="Arial" w:eastAsia="Arial" w:hAnsi="Arial"/>
+          <w:sz w:val="20"/>
+          <w:szCs w:val="20"/>
+        </w:rPr>
+        <w:t xml:space="preserve">Cortar y doblar la plancha en una sola pieza por techo, con la sección 0.18 x 0.21 m y el ala posterior de 0.10 m.</w:t>
+      </w:r>
+    </w:p>
+    <w:p>
+      <w:pPr>
+        <w:pStyle w:val="ListParagraph"/>
+        <w:numPr>
+          <w:ilvl w:val="0"/>
+          <w:numId w:val="2"/>
+        </w:numPr>
+        <w:spacing w:after="60" w:line="264"/>
+        <w:jc w:val="both"/>
+      </w:pPr>
+      <w:r>
+        <w:rPr>
+          <w:rFonts w:ascii="Arial" w:cs="Arial" w:eastAsia="Arial" w:hAnsi="Arial"/>
+          <w:sz w:val="20"/>
+          <w:szCs w:val="20"/>
+        </w:rPr>
+        <w:t xml:space="preserve">Colocar la canaleta sobre sus dos soportes con pendiente de 0.5 % hacia la boquilla, con el ala bajo la cobertura y por encima de la viga.</w:t>
+      </w:r>
+    </w:p>
+    <w:p>
+      <w:pPr>
+        <w:pStyle w:val="ListParagraph"/>
+        <w:numPr>
+          <w:ilvl w:val="0"/>
+          <w:numId w:val="2"/>
+        </w:numPr>
+        <w:spacing w:after="60" w:line="264"/>
+        <w:jc w:val="both"/>
+      </w:pPr>
+      <w:r>
+        <w:rPr>
+          <w:rFonts w:ascii="Arial" w:cs="Arial" w:eastAsia="Arial" w:hAnsi="Arial"/>
+          <w:sz w:val="20"/>
+          <w:szCs w:val="20"/>
+        </w:rPr>
+        <w:t xml:space="preserve">Sellar los remaches y uniones con las tapas y la boquilla; probar con agua.</w:t>
+      </w:r>
+    </w:p>
+    <w:p>
+      <w:pPr>
+        <w:keepNext/>
+        <w:spacing w:after="60" w:before="120"/>
+      </w:pPr>
+      <w:r>
+        <w:rPr>
+          <w:rFonts w:ascii="Arial" w:cs="Arial" w:eastAsia="Arial" w:hAnsi="Arial"/>
+          <w:b/>
+          <w:bCs/>
+          <w:color w:val="1F3864"/>
+          <w:sz w:val="19"/>
+          <w:szCs w:val="19"/>
+        </w:rPr>
+        <w:t xml:space="preserve">CONTROL DE CALIDAD Y TOLERANCIAS</w:t>
+      </w:r>
+    </w:p>
+    <w:p>
+      <w:pPr>
+        <w:pStyle w:val="ListParagraph"/>
+        <w:numPr>
+          <w:ilvl w:val="0"/>
+          <w:numId w:val="2"/>
+        </w:numPr>
+        <w:spacing w:after="60" w:line="264"/>
+        <w:jc w:val="both"/>
+      </w:pPr>
+      <w:r>
+        <w:rPr>
+          <w:rFonts w:ascii="Arial" w:cs="Arial" w:eastAsia="Arial" w:hAnsi="Arial"/>
+          <w:sz w:val="20"/>
+          <w:szCs w:val="20"/>
+        </w:rPr>
+        <w:t xml:space="preserve">Sección interior 0.18 x 0.21 m (tolerancia 5 mm); pendiente continua hacia la boquilla sin contrapendientes; sin filtraciones en la prueba con agua.</w:t>
+      </w:r>
+    </w:p>
+    <w:p>
+      <w:pPr>
+        <w:keepNext/>
+        <w:spacing w:after="60" w:before="120"/>
+      </w:pPr>
+      <w:r>
+        <w:rPr>
+          <w:rFonts w:ascii="Arial" w:cs="Arial" w:eastAsia="Arial" w:hAnsi="Arial"/>
+          <w:b/>
+          <w:bCs/>
+          <w:color w:val="1F3864"/>
+          <w:sz w:val="19"/>
+          <w:szCs w:val="19"/>
+        </w:rPr>
+        <w:t xml:space="preserve">SEGURIDAD Y SALUD EN EL TRABAJO</w:t>
+      </w:r>
+    </w:p>
+    <w:p>
+      <w:pPr>
+        <w:pStyle w:val="ListParagraph"/>
+        <w:numPr>
+          <w:ilvl w:val="0"/>
+          <w:numId w:val="2"/>
+        </w:numPr>
+        <w:spacing w:after="60" w:line="264"/>
+        <w:jc w:val="both"/>
+      </w:pPr>
+      <w:r>
+        <w:rPr>
+          <w:rFonts w:ascii="Arial" w:cs="Arial" w:eastAsia="Arial" w:hAnsi="Arial"/>
+          <w:sz w:val="20"/>
+          <w:szCs w:val="20"/>
+        </w:rPr>
+        <w:t xml:space="preserve">Uso obligatorio de equipo de protección personal: casco, lentes de seguridad, guantes, botas con puntera de acero y chaleco reflectivo (DS N.° 011-2019-TR y Norma G.050).</w:t>
+      </w:r>
+    </w:p>
+    <w:p>
+      <w:pPr>
+        <w:pStyle w:val="ListParagraph"/>
+        <w:numPr>
+          <w:ilvl w:val="0"/>
+          <w:numId w:val="2"/>
+        </w:numPr>
+        <w:spacing w:after="60" w:line="264"/>
+        <w:jc w:val="both"/>
+      </w:pPr>
+      <w:r>
+        <w:rPr>
+          <w:rFonts w:ascii="Arial" w:cs="Arial" w:eastAsia="Arial" w:hAnsi="Arial"/>
+          <w:sz w:val="20"/>
+          <w:szCs w:val="20"/>
+        </w:rPr>
+        <w:t xml:space="preserve">Trabajo a 2.80 m de altura sobre la banca: escalera de tijera o andamio estable, arnés cuando no se trabaje desde plataforma (Norma G.050).</w:t>
+      </w:r>
+    </w:p>
+    <w:p>
+      <w:pPr>
+        <w:pStyle w:val="ListParagraph"/>
+        <w:numPr>
+          <w:ilvl w:val="0"/>
+          <w:numId w:val="2"/>
+        </w:numPr>
+        <w:spacing w:after="60" w:line="264"/>
+        <w:jc w:val="both"/>
+      </w:pPr>
+      <w:r>
+        <w:rPr>
+          <w:rFonts w:ascii="Arial" w:cs="Arial" w:eastAsia="Arial" w:hAnsi="Arial"/>
+          <w:sz w:val="20"/>
+          <w:szCs w:val="20"/>
+        </w:rPr>
+        <w:t xml:space="preserve">Guantes de cuero para manipular la plancha; proteger los bordes cortados.</w:t>
+      </w:r>
+    </w:p>
+    <w:p>
+      <w:pPr>
+        <w:keepNext/>
+        <w:spacing w:after="60" w:before="120"/>
+      </w:pPr>
+      <w:r>
+        <w:rPr>
+          <w:rFonts w:ascii="Arial" w:cs="Arial" w:eastAsia="Arial" w:hAnsi="Arial"/>
+          <w:b/>
+          <w:bCs/>
+          <w:color w:val="1F3864"/>
+          <w:sz w:val="19"/>
+          <w:szCs w:val="19"/>
+        </w:rPr>
+        <w:t xml:space="preserve">UNIDAD DE MEDIDA</w:t>
+      </w:r>
+    </w:p>
+    <w:p>
+      <w:pPr>
+        <w:spacing w:after="100" w:before="0" w:line="276"/>
+        <w:jc w:val="both"/>
+      </w:pPr>
+      <w:r>
+        <w:rPr>
+          <w:rFonts w:ascii="Arial" w:cs="Arial" w:eastAsia="Arial" w:hAnsi="Arial"/>
+          <w:sz w:val="20"/>
+          <w:szCs w:val="20"/>
+        </w:rPr>
+        <w:t xml:space="preserve">La unidad de medida es: metro lineal (m).</w:t>
+      </w:r>
+    </w:p>
+    <w:p>
+      <w:pPr>
+        <w:keepNext/>
+        <w:spacing w:after="60" w:before="120"/>
+      </w:pPr>
+      <w:r>
+        <w:rPr>
+          <w:rFonts w:ascii="Arial" w:cs="Arial" w:eastAsia="Arial" w:hAnsi="Arial"/>
+          <w:b/>
+          <w:bCs/>
+          <w:color w:val="1F3864"/>
+          <w:sz w:val="19"/>
+          <w:szCs w:val="19"/>
+        </w:rPr>
+        <w:t xml:space="preserve">MÉTODO DE MEDICIÓN</w:t>
+      </w:r>
+    </w:p>
+    <w:p>
+      <w:pPr>
+        <w:spacing w:after="100" w:before="0" w:line="276"/>
+        <w:jc w:val="both"/>
+      </w:pPr>
+      <w:r>
+        <w:rPr>
+          <w:rFonts w:ascii="Arial" w:cs="Arial" w:eastAsia="Arial" w:hAnsi="Arial"/>
+          <w:sz w:val="20"/>
+          <w:szCs w:val="20"/>
+        </w:rPr>
+        <w:t xml:space="preserve">Se medirá en metros lineales de canaleta instalada: largo de cada techo (3.79, 4.21 y 3.79 m) por el número de juegos OC-01, como en la hoja METRADO CANALETA BANCAS.</w:t>
+      </w:r>
+    </w:p>
+    <w:p>
+      <w:pPr>
+        <w:keepNext/>
+        <w:spacing w:after="60" w:before="120"/>
+      </w:pPr>
+      <w:r>
+        <w:rPr>
+          <w:rFonts w:ascii="Arial" w:cs="Arial" w:eastAsia="Arial" w:hAnsi="Arial"/>
+          <w:b/>
+          <w:bCs/>
+          <w:color w:val="1F3864"/>
+          <w:sz w:val="19"/>
+          <w:szCs w:val="19"/>
+        </w:rPr>
+        <w:t xml:space="preserve">FORMA DE PAGO</w:t>
+      </w:r>
+    </w:p>
+    <w:p>
+      <w:pPr>
+        <w:spacing w:after="100" w:before="0" w:line="276"/>
+        <w:jc w:val="both"/>
+      </w:pPr>
+      <w:r>
+        <w:rPr>
+          <w:rFonts w:ascii="Arial" w:cs="Arial" w:eastAsia="Arial" w:hAnsi="Arial"/>
+          <w:sz w:val="20"/>
+          <w:szCs w:val="20"/>
+        </w:rPr>
+        <w:t xml:space="preserve">El pago se efectuará al precio unitario del presupuesto por metro lineal (m), de acuerdo con el avance valorizado y con la conformidad de la Supervisión. Dicho precio y pago constituye compensación total por la mano de obra (incluidas las leyes sociales), los materiales, el equipo, las herramientas, el transporte interno y todo imprevisto necesario para ejecutar la partida según esta especificación y los planos.</w:t>
+      </w:r>
+    </w:p>
+    <w:p>
+      <w:pPr>
+        <w:pStyle w:val="Heading5"/>
+        <w:keepNext/>
+      </w:pPr>
+      <w:r>
+        <w:t xml:space="preserve">01.04.03.05.04.02  SOPORTE DE PLATINA F°G° 1" x 1/8" P/CANALETA  (und)</w:t>
+      </w:r>
+    </w:p>
+    <w:p>
+      <w:pPr>
+        <w:keepNext/>
+        <w:spacing w:after="60" w:before="120"/>
+      </w:pPr>
+      <w:r>
+        <w:rPr>
+          <w:rFonts w:ascii="Arial" w:cs="Arial" w:eastAsia="Arial" w:hAnsi="Arial"/>
+          <w:b/>
+          <w:bCs/>
+          <w:color w:val="1F3864"/>
+          <w:sz w:val="19"/>
+          <w:szCs w:val="19"/>
+        </w:rPr>
+        <w:t xml:space="preserve">DESCRIPCIÓN</w:t>
+      </w:r>
+    </w:p>
+    <w:p>
+      <w:pPr>
+        <w:spacing w:after="100" w:before="0" w:line="276"/>
+        <w:jc w:val="both"/>
+      </w:pPr>
+      <w:r>
+        <w:rPr>
+          <w:rFonts w:ascii="Arial" w:cs="Arial" w:eastAsia="Arial" w:hAnsi="Arial"/>
+          <w:sz w:val="20"/>
+          <w:szCs w:val="20"/>
+        </w:rPr>
+        <w:t xml:space="preserve">Comprende la fabricación y colocación de los soportes (sujetadores) de platina de fierro galvanizado de 1" x 1/8" que abrazan la canaleta de las bancas (fondo y lados) y se fijan a la viga de la pérgola: dos por canaleta, a 0.80 m de cada extremo en los techos de 3.79 m y a 0.85 m en el de 4.21 m (lámina DPL-41).</w:t>
+      </w:r>
+    </w:p>
+    <w:p>
+      <w:pPr>
+        <w:keepNext/>
+        <w:spacing w:after="60" w:before="120"/>
+      </w:pPr>
+      <w:r>
+        <w:rPr>
+          <w:rFonts w:ascii="Arial" w:cs="Arial" w:eastAsia="Arial" w:hAnsi="Arial"/>
+          <w:b/>
+          <w:bCs/>
+          <w:color w:val="1F3864"/>
+          <w:sz w:val="19"/>
+          <w:szCs w:val="19"/>
+        </w:rPr>
+        <w:t xml:space="preserve">MATERIALES</w:t>
+      </w:r>
+    </w:p>
+    <w:p>
+      <w:pPr>
+        <w:pStyle w:val="ListParagraph"/>
+        <w:numPr>
+          <w:ilvl w:val="0"/>
+          <w:numId w:val="2"/>
+        </w:numPr>
+        <w:spacing w:after="60" w:line="264"/>
+        <w:jc w:val="both"/>
+      </w:pPr>
+      <w:r>
+        <w:rPr>
+          <w:rFonts w:ascii="Arial" w:cs="Arial" w:eastAsia="Arial" w:hAnsi="Arial"/>
+          <w:sz w:val="20"/>
+          <w:szCs w:val="20"/>
+        </w:rPr>
+        <w:t xml:space="preserve">Platina de F°G° de 1" x 1/8" (desarrollo 0.70 m por soporte); pernos autorroscantes galvanizados con arandela de neopreno.</w:t>
+      </w:r>
+    </w:p>
+    <w:p>
+      <w:pPr>
+        <w:keepNext/>
+        <w:spacing w:after="60" w:before="120"/>
+      </w:pPr>
+      <w:r>
+        <w:rPr>
+          <w:rFonts w:ascii="Arial" w:cs="Arial" w:eastAsia="Arial" w:hAnsi="Arial"/>
+          <w:b/>
+          <w:bCs/>
+          <w:color w:val="1F3864"/>
+          <w:sz w:val="19"/>
+          <w:szCs w:val="19"/>
+        </w:rPr>
+        <w:t xml:space="preserve">EQUIPOS Y HERRAMIENTAS</w:t>
+      </w:r>
+    </w:p>
+    <w:p>
+      <w:pPr>
+        <w:pStyle w:val="ListParagraph"/>
+        <w:numPr>
+          <w:ilvl w:val="0"/>
+          <w:numId w:val="2"/>
+        </w:numPr>
+        <w:spacing w:after="60" w:line="264"/>
+        <w:jc w:val="both"/>
+      </w:pPr>
+      <w:r>
+        <w:rPr>
+          <w:rFonts w:ascii="Arial" w:cs="Arial" w:eastAsia="Arial" w:hAnsi="Arial"/>
+          <w:sz w:val="20"/>
+          <w:szCs w:val="20"/>
+        </w:rPr>
+        <w:t xml:space="preserve">Dobladora, taladro, amoladora, nivel.</w:t>
+      </w:r>
+    </w:p>
+    <w:p>
+      <w:pPr>
+        <w:keepNext/>
+        <w:spacing w:after="60" w:before="120"/>
+      </w:pPr>
+      <w:r>
+        <w:rPr>
+          <w:rFonts w:ascii="Arial" w:cs="Arial" w:eastAsia="Arial" w:hAnsi="Arial"/>
+          <w:b/>
+          <w:bCs/>
+          <w:color w:val="1F3864"/>
+          <w:sz w:val="19"/>
+          <w:szCs w:val="19"/>
+        </w:rPr>
+        <w:t xml:space="preserve">PROCEDIMIENTO DE EJECUCIÓN</w:t>
+      </w:r>
+    </w:p>
+    <w:p>
+      <w:pPr>
+        <w:pStyle w:val="ListParagraph"/>
+        <w:numPr>
+          <w:ilvl w:val="0"/>
+          <w:numId w:val="2"/>
+        </w:numPr>
+        <w:spacing w:after="60" w:line="264"/>
+        <w:jc w:val="both"/>
+      </w:pPr>
+      <w:r>
+        <w:rPr>
+          <w:rFonts w:ascii="Arial" w:cs="Arial" w:eastAsia="Arial" w:hAnsi="Arial"/>
+          <w:sz w:val="20"/>
+          <w:szCs w:val="20"/>
+        </w:rPr>
+        <w:t xml:space="preserve">Cortar y doblar la platina con la forma de la canaleta y la oreja de fijación.</w:t>
+      </w:r>
+    </w:p>
+    <w:p>
+      <w:pPr>
+        <w:pStyle w:val="ListParagraph"/>
+        <w:numPr>
+          <w:ilvl w:val="0"/>
+          <w:numId w:val="2"/>
+        </w:numPr>
+        <w:spacing w:after="60" w:line="264"/>
+        <w:jc w:val="both"/>
+      </w:pPr>
+      <w:r>
+        <w:rPr>
+          <w:rFonts w:ascii="Arial" w:cs="Arial" w:eastAsia="Arial" w:hAnsi="Arial"/>
+          <w:sz w:val="20"/>
+          <w:szCs w:val="20"/>
+        </w:rPr>
+        <w:t xml:space="preserve">Fijar a la viga con la altura que da la pendiente de 0.5 % hacia la boquilla.</w:t>
+      </w:r>
+    </w:p>
+    <w:p>
+      <w:pPr>
+        <w:pStyle w:val="ListParagraph"/>
+        <w:numPr>
+          <w:ilvl w:val="0"/>
+          <w:numId w:val="2"/>
+        </w:numPr>
+        <w:spacing w:after="60" w:line="264"/>
+        <w:jc w:val="both"/>
+      </w:pPr>
+      <w:r>
+        <w:rPr>
+          <w:rFonts w:ascii="Arial" w:cs="Arial" w:eastAsia="Arial" w:hAnsi="Arial"/>
+          <w:sz w:val="20"/>
+          <w:szCs w:val="20"/>
+        </w:rPr>
+        <w:t xml:space="preserve">Repintar con pintura rica en zinc los cortes y perforaciones.</w:t>
+      </w:r>
+    </w:p>
+    <w:p>
+      <w:pPr>
+        <w:keepNext/>
+        <w:spacing w:after="60" w:before="120"/>
+      </w:pPr>
+      <w:r>
+        <w:rPr>
+          <w:rFonts w:ascii="Arial" w:cs="Arial" w:eastAsia="Arial" w:hAnsi="Arial"/>
+          <w:b/>
+          <w:bCs/>
+          <w:color w:val="1F3864"/>
+          <w:sz w:val="19"/>
+          <w:szCs w:val="19"/>
+        </w:rPr>
+        <w:t xml:space="preserve">CONTROL DE CALIDAD Y TOLERANCIAS</w:t>
+      </w:r>
+    </w:p>
+    <w:p>
+      <w:pPr>
+        <w:pStyle w:val="ListParagraph"/>
+        <w:numPr>
+          <w:ilvl w:val="0"/>
+          <w:numId w:val="2"/>
+        </w:numPr>
+        <w:spacing w:after="60" w:line="264"/>
+        <w:jc w:val="both"/>
+      </w:pPr>
+      <w:r>
+        <w:rPr>
+          <w:rFonts w:ascii="Arial" w:cs="Arial" w:eastAsia="Arial" w:hAnsi="Arial"/>
+          <w:sz w:val="20"/>
+          <w:szCs w:val="20"/>
+        </w:rPr>
+        <w:t xml:space="preserve">Dos soportes por canaleta, firmes y alineados; canaleta sin flecha entre soportes.</w:t>
+      </w:r>
+    </w:p>
+    <w:p>
+      <w:pPr>
+        <w:keepNext/>
+        <w:spacing w:after="60" w:before="120"/>
+      </w:pPr>
+      <w:r>
+        <w:rPr>
+          <w:rFonts w:ascii="Arial" w:cs="Arial" w:eastAsia="Arial" w:hAnsi="Arial"/>
+          <w:b/>
+          <w:bCs/>
+          <w:color w:val="1F3864"/>
+          <w:sz w:val="19"/>
+          <w:szCs w:val="19"/>
+        </w:rPr>
+        <w:t xml:space="preserve">SEGURIDAD Y SALUD EN EL TRABAJO</w:t>
+      </w:r>
+    </w:p>
+    <w:p>
+      <w:pPr>
+        <w:pStyle w:val="ListParagraph"/>
+        <w:numPr>
+          <w:ilvl w:val="0"/>
+          <w:numId w:val="2"/>
+        </w:numPr>
+        <w:spacing w:after="60" w:line="264"/>
+        <w:jc w:val="both"/>
+      </w:pPr>
+      <w:r>
+        <w:rPr>
+          <w:rFonts w:ascii="Arial" w:cs="Arial" w:eastAsia="Arial" w:hAnsi="Arial"/>
+          <w:sz w:val="20"/>
+          <w:szCs w:val="20"/>
+        </w:rPr>
+        <w:t xml:space="preserve">Uso obligatorio de equipo de protección personal: casco, lentes de seguridad, guantes, botas con puntera de acero y chaleco reflectivo (DS N.° 011-2019-TR y Norma G.050).</w:t>
+      </w:r>
+    </w:p>
+    <w:p>
+      <w:pPr>
+        <w:pStyle w:val="ListParagraph"/>
+        <w:numPr>
+          <w:ilvl w:val="0"/>
+          <w:numId w:val="2"/>
+        </w:numPr>
+        <w:spacing w:after="60" w:line="264"/>
+        <w:jc w:val="both"/>
+      </w:pPr>
+      <w:r>
+        <w:rPr>
+          <w:rFonts w:ascii="Arial" w:cs="Arial" w:eastAsia="Arial" w:hAnsi="Arial"/>
+          <w:sz w:val="20"/>
+          <w:szCs w:val="20"/>
+        </w:rPr>
+        <w:t xml:space="preserve">Trabajo a 2.80 m de altura sobre la banca: escalera de tijera o andamio estable, arnés cuando no se trabaje desde plataforma (Norma G.050).</w:t>
+      </w:r>
+    </w:p>
+    <w:p>
+      <w:pPr>
+        <w:pStyle w:val="ListParagraph"/>
+        <w:numPr>
+          <w:ilvl w:val="0"/>
+          <w:numId w:val="2"/>
+        </w:numPr>
+        <w:spacing w:after="60" w:line="264"/>
+        <w:jc w:val="both"/>
+      </w:pPr>
+      <w:r>
+        <w:rPr>
+          <w:rFonts w:ascii="Arial" w:cs="Arial" w:eastAsia="Arial" w:hAnsi="Arial"/>
+          <w:sz w:val="20"/>
+          <w:szCs w:val="20"/>
+        </w:rPr>
+        <w:t xml:space="preserve">Guantes de cuero para manipular la plancha; proteger los bordes cortados.</w:t>
+      </w:r>
+    </w:p>
+    <w:p>
+      <w:pPr>
+        <w:keepNext/>
+        <w:spacing w:after="60" w:before="120"/>
+      </w:pPr>
+      <w:r>
+        <w:rPr>
+          <w:rFonts w:ascii="Arial" w:cs="Arial" w:eastAsia="Arial" w:hAnsi="Arial"/>
+          <w:b/>
+          <w:bCs/>
+          <w:color w:val="1F3864"/>
+          <w:sz w:val="19"/>
+          <w:szCs w:val="19"/>
+        </w:rPr>
+        <w:t xml:space="preserve">UNIDAD DE MEDIDA</w:t>
+      </w:r>
+    </w:p>
+    <w:p>
+      <w:pPr>
+        <w:spacing w:after="100" w:before="0" w:line="276"/>
+        <w:jc w:val="both"/>
+      </w:pPr>
+      <w:r>
+        <w:rPr>
+          <w:rFonts w:ascii="Arial" w:cs="Arial" w:eastAsia="Arial" w:hAnsi="Arial"/>
+          <w:sz w:val="20"/>
+          <w:szCs w:val="20"/>
+        </w:rPr>
+        <w:t xml:space="preserve">La unidad de medida es: unidad (und).</w:t>
+      </w:r>
+    </w:p>
+    <w:p>
+      <w:pPr>
+        <w:keepNext/>
+        <w:spacing w:after="60" w:before="120"/>
+      </w:pPr>
+      <w:r>
+        <w:rPr>
+          <w:rFonts w:ascii="Arial" w:cs="Arial" w:eastAsia="Arial" w:hAnsi="Arial"/>
+          <w:b/>
+          <w:bCs/>
+          <w:color w:val="1F3864"/>
+          <w:sz w:val="19"/>
+          <w:szCs w:val="19"/>
+        </w:rPr>
+        <w:t xml:space="preserve">MÉTODO DE MEDICIÓN</w:t>
+      </w:r>
+    </w:p>
+    <w:p>
+      <w:pPr>
+        <w:spacing w:after="100" w:before="0" w:line="276"/>
+        <w:jc w:val="both"/>
+      </w:pPr>
+      <w:r>
+        <w:rPr>
+          <w:rFonts w:ascii="Arial" w:cs="Arial" w:eastAsia="Arial" w:hAnsi="Arial"/>
+          <w:sz w:val="20"/>
+          <w:szCs w:val="20"/>
+        </w:rPr>
+        <w:t xml:space="preserve">Se contará el número de soportes instalados (2 por canaleta, 6 por juego OC-01).</w:t>
+      </w:r>
+    </w:p>
+    <w:p>
+      <w:pPr>
+        <w:keepNext/>
+        <w:spacing w:after="60" w:before="120"/>
+      </w:pPr>
+      <w:r>
+        <w:rPr>
+          <w:rFonts w:ascii="Arial" w:cs="Arial" w:eastAsia="Arial" w:hAnsi="Arial"/>
+          <w:b/>
+          <w:bCs/>
+          <w:color w:val="1F3864"/>
+          <w:sz w:val="19"/>
+          <w:szCs w:val="19"/>
+        </w:rPr>
+        <w:t xml:space="preserve">FORMA DE PAGO</w:t>
+      </w:r>
+    </w:p>
+    <w:p>
+      <w:pPr>
+        <w:spacing w:after="100" w:before="0" w:line="276"/>
+        <w:jc w:val="both"/>
+      </w:pPr>
+      <w:r>
+        <w:rPr>
+          <w:rFonts w:ascii="Arial" w:cs="Arial" w:eastAsia="Arial" w:hAnsi="Arial"/>
+          <w:sz w:val="20"/>
+          <w:szCs w:val="20"/>
+        </w:rPr>
+        <w:t xml:space="preserve">El pago se efectuará al precio unitario del presupuesto por unidad (und), de acuerdo con el avance valorizado y con la conformidad de la Supervisión. Dicho precio y pago constituye compensación total por la mano de obra (incluidas las leyes sociales), los materiales, el equipo, las herramientas, el transporte interno y todo imprevisto necesario para ejecutar la partida según esta especificación y los planos.</w:t>
+      </w:r>
+    </w:p>
+    <w:p>
+      <w:pPr>
+        <w:pStyle w:val="Heading5"/>
+        <w:keepNext/>
+      </w:pPr>
+      <w:r>
+        <w:t xml:space="preserve">01.04.03.05.04.03  TAPA LATERAL DE PLANCHA GALVANIZADA P/CANALETA  (und)</w:t>
+      </w:r>
+    </w:p>
+    <w:p>
+      <w:pPr>
+        <w:keepNext/>
+        <w:spacing w:after="60" w:before="120"/>
+      </w:pPr>
+      <w:r>
+        <w:rPr>
+          <w:rFonts w:ascii="Arial" w:cs="Arial" w:eastAsia="Arial" w:hAnsi="Arial"/>
+          <w:b/>
+          <w:bCs/>
+          <w:color w:val="1F3864"/>
+          <w:sz w:val="19"/>
+          <w:szCs w:val="19"/>
+        </w:rPr>
+        <w:t xml:space="preserve">DESCRIPCIÓN</w:t>
+      </w:r>
+    </w:p>
+    <w:p>
+      <w:pPr>
+        <w:spacing w:after="100" w:before="0" w:line="276"/>
+        <w:jc w:val="both"/>
+      </w:pPr>
+      <w:r>
+        <w:rPr>
+          <w:rFonts w:ascii="Arial" w:cs="Arial" w:eastAsia="Arial" w:hAnsi="Arial"/>
+          <w:sz w:val="20"/>
+          <w:szCs w:val="20"/>
+        </w:rPr>
+        <w:t xml:space="preserve">Comprende la fabricación y colocación de las tapas laterales de plancha galvanizada de 0.50 mm que cierran los dos extremos de cada canaleta de las bancas.</w:t>
+      </w:r>
+    </w:p>
+    <w:p>
+      <w:pPr>
+        <w:keepNext/>
+        <w:spacing w:after="60" w:before="120"/>
+      </w:pPr>
+      <w:r>
+        <w:rPr>
+          <w:rFonts w:ascii="Arial" w:cs="Arial" w:eastAsia="Arial" w:hAnsi="Arial"/>
+          <w:b/>
+          <w:bCs/>
+          <w:color w:val="1F3864"/>
+          <w:sz w:val="19"/>
+          <w:szCs w:val="19"/>
+        </w:rPr>
+        <w:t xml:space="preserve">MATERIALES</w:t>
+      </w:r>
+    </w:p>
+    <w:p>
+      <w:pPr>
+        <w:pStyle w:val="ListParagraph"/>
+        <w:numPr>
+          <w:ilvl w:val="0"/>
+          <w:numId w:val="2"/>
+        </w:numPr>
+        <w:spacing w:after="60" w:line="264"/>
+        <w:jc w:val="both"/>
+      </w:pPr>
+      <w:r>
+        <w:rPr>
+          <w:rFonts w:ascii="Arial" w:cs="Arial" w:eastAsia="Arial" w:hAnsi="Arial"/>
+          <w:sz w:val="20"/>
+          <w:szCs w:val="20"/>
+        </w:rPr>
+        <w:t xml:space="preserve">Plancha galvanizada de 0.50 mm; remaches pop de 1/8"; sellador de poliuretano.</w:t>
+      </w:r>
+    </w:p>
+    <w:p>
+      <w:pPr>
+        <w:keepNext/>
+        <w:spacing w:after="60" w:before="120"/>
+      </w:pPr>
+      <w:r>
+        <w:rPr>
+          <w:rFonts w:ascii="Arial" w:cs="Arial" w:eastAsia="Arial" w:hAnsi="Arial"/>
+          <w:b/>
+          <w:bCs/>
+          <w:color w:val="1F3864"/>
+          <w:sz w:val="19"/>
+          <w:szCs w:val="19"/>
+        </w:rPr>
+        <w:t xml:space="preserve">EQUIPOS Y HERRAMIENTAS</w:t>
+      </w:r>
+    </w:p>
+    <w:p>
+      <w:pPr>
+        <w:pStyle w:val="ListParagraph"/>
+        <w:numPr>
+          <w:ilvl w:val="0"/>
+          <w:numId w:val="2"/>
+        </w:numPr>
+        <w:spacing w:after="60" w:line="264"/>
+        <w:jc w:val="both"/>
+      </w:pPr>
+      <w:r>
+        <w:rPr>
+          <w:rFonts w:ascii="Arial" w:cs="Arial" w:eastAsia="Arial" w:hAnsi="Arial"/>
+          <w:sz w:val="20"/>
+          <w:szCs w:val="20"/>
+        </w:rPr>
+        <w:t xml:space="preserve">Tijera de hojalatero, remachadora.</w:t>
+      </w:r>
+    </w:p>
+    <w:p>
+      <w:pPr>
+        <w:keepNext/>
+        <w:spacing w:after="60" w:before="120"/>
+      </w:pPr>
+      <w:r>
+        <w:rPr>
+          <w:rFonts w:ascii="Arial" w:cs="Arial" w:eastAsia="Arial" w:hAnsi="Arial"/>
+          <w:b/>
+          <w:bCs/>
+          <w:color w:val="1F3864"/>
+          <w:sz w:val="19"/>
+          <w:szCs w:val="19"/>
+        </w:rPr>
+        <w:t xml:space="preserve">PROCEDIMIENTO DE EJECUCIÓN</w:t>
+      </w:r>
+    </w:p>
+    <w:p>
+      <w:pPr>
+        <w:pStyle w:val="ListParagraph"/>
+        <w:numPr>
+          <w:ilvl w:val="0"/>
+          <w:numId w:val="2"/>
+        </w:numPr>
+        <w:spacing w:after="60" w:line="264"/>
+        <w:jc w:val="both"/>
+      </w:pPr>
+      <w:r>
+        <w:rPr>
+          <w:rFonts w:ascii="Arial" w:cs="Arial" w:eastAsia="Arial" w:hAnsi="Arial"/>
+          <w:sz w:val="20"/>
+          <w:szCs w:val="20"/>
+        </w:rPr>
+        <w:t xml:space="preserve">Cortar la tapa con la sección 0.18 x 0.21 m más pestañas de 0.02 m.</w:t>
+      </w:r>
+    </w:p>
+    <w:p>
+      <w:pPr>
+        <w:pStyle w:val="ListParagraph"/>
+        <w:numPr>
+          <w:ilvl w:val="0"/>
+          <w:numId w:val="2"/>
+        </w:numPr>
+        <w:spacing w:after="60" w:line="264"/>
+        <w:jc w:val="both"/>
+      </w:pPr>
+      <w:r>
+        <w:rPr>
+          <w:rFonts w:ascii="Arial" w:cs="Arial" w:eastAsia="Arial" w:hAnsi="Arial"/>
+          <w:sz w:val="20"/>
+          <w:szCs w:val="20"/>
+        </w:rPr>
+        <w:t xml:space="preserve">Remacharla al extremo y sellar el contorno.</w:t>
+      </w:r>
+    </w:p>
+    <w:p>
+      <w:pPr>
+        <w:keepNext/>
+        <w:spacing w:after="60" w:before="120"/>
+      </w:pPr>
+      <w:r>
+        <w:rPr>
+          <w:rFonts w:ascii="Arial" w:cs="Arial" w:eastAsia="Arial" w:hAnsi="Arial"/>
+          <w:b/>
+          <w:bCs/>
+          <w:color w:val="1F3864"/>
+          <w:sz w:val="19"/>
+          <w:szCs w:val="19"/>
+        </w:rPr>
+        <w:t xml:space="preserve">CONTROL DE CALIDAD Y TOLERANCIAS</w:t>
+      </w:r>
+    </w:p>
+    <w:p>
+      <w:pPr>
+        <w:pStyle w:val="ListParagraph"/>
+        <w:numPr>
+          <w:ilvl w:val="0"/>
+          <w:numId w:val="2"/>
+        </w:numPr>
+        <w:spacing w:after="60" w:line="264"/>
+        <w:jc w:val="both"/>
+      </w:pPr>
+      <w:r>
+        <w:rPr>
+          <w:rFonts w:ascii="Arial" w:cs="Arial" w:eastAsia="Arial" w:hAnsi="Arial"/>
+          <w:sz w:val="20"/>
+          <w:szCs w:val="20"/>
+        </w:rPr>
+        <w:t xml:space="preserve">Cierre estanco, sin filtraciones.</w:t>
+      </w:r>
+    </w:p>
+    <w:p>
+      <w:pPr>
+        <w:keepNext/>
+        <w:spacing w:after="60" w:before="120"/>
+      </w:pPr>
+      <w:r>
+        <w:rPr>
+          <w:rFonts w:ascii="Arial" w:cs="Arial" w:eastAsia="Arial" w:hAnsi="Arial"/>
+          <w:b/>
+          <w:bCs/>
+          <w:color w:val="1F3864"/>
+          <w:sz w:val="19"/>
+          <w:szCs w:val="19"/>
+        </w:rPr>
+        <w:t xml:space="preserve">SEGURIDAD Y SALUD EN EL TRABAJO</w:t>
+      </w:r>
+    </w:p>
+    <w:p>
+      <w:pPr>
+        <w:pStyle w:val="ListParagraph"/>
+        <w:numPr>
+          <w:ilvl w:val="0"/>
+          <w:numId w:val="2"/>
+        </w:numPr>
+        <w:spacing w:after="60" w:line="264"/>
+        <w:jc w:val="both"/>
+      </w:pPr>
+      <w:r>
+        <w:rPr>
+          <w:rFonts w:ascii="Arial" w:cs="Arial" w:eastAsia="Arial" w:hAnsi="Arial"/>
+          <w:sz w:val="20"/>
+          <w:szCs w:val="20"/>
+        </w:rPr>
+        <w:t xml:space="preserve">Uso obligatorio de equipo de protección personal: casco, lentes de seguridad, guantes, botas con puntera de acero y chaleco reflectivo (DS N.° 011-2019-TR y Norma G.050).</w:t>
+      </w:r>
+    </w:p>
+    <w:p>
+      <w:pPr>
+        <w:pStyle w:val="ListParagraph"/>
+        <w:numPr>
+          <w:ilvl w:val="0"/>
+          <w:numId w:val="2"/>
+        </w:numPr>
+        <w:spacing w:after="60" w:line="264"/>
+        <w:jc w:val="both"/>
+      </w:pPr>
+      <w:r>
+        <w:rPr>
+          <w:rFonts w:ascii="Arial" w:cs="Arial" w:eastAsia="Arial" w:hAnsi="Arial"/>
+          <w:sz w:val="20"/>
+          <w:szCs w:val="20"/>
+        </w:rPr>
+        <w:t xml:space="preserve">Trabajo a 2.80 m de altura sobre la banca: escalera de tijera o andamio estable, arnés cuando no se trabaje desde plataforma (Norma G.050).</w:t>
+      </w:r>
+    </w:p>
+    <w:p>
+      <w:pPr>
+        <w:pStyle w:val="ListParagraph"/>
+        <w:numPr>
+          <w:ilvl w:val="0"/>
+          <w:numId w:val="2"/>
+        </w:numPr>
+        <w:spacing w:after="60" w:line="264"/>
+        <w:jc w:val="both"/>
+      </w:pPr>
+      <w:r>
+        <w:rPr>
+          <w:rFonts w:ascii="Arial" w:cs="Arial" w:eastAsia="Arial" w:hAnsi="Arial"/>
+          <w:sz w:val="20"/>
+          <w:szCs w:val="20"/>
+        </w:rPr>
+        <w:t xml:space="preserve">Guantes de cuero para manipular la plancha; proteger los bordes cortados.</w:t>
+      </w:r>
+    </w:p>
+    <w:p>
+      <w:pPr>
+        <w:keepNext/>
+        <w:spacing w:after="60" w:before="120"/>
+      </w:pPr>
+      <w:r>
+        <w:rPr>
+          <w:rFonts w:ascii="Arial" w:cs="Arial" w:eastAsia="Arial" w:hAnsi="Arial"/>
+          <w:b/>
+          <w:bCs/>
+          <w:color w:val="1F3864"/>
+          <w:sz w:val="19"/>
+          <w:szCs w:val="19"/>
+        </w:rPr>
+        <w:t xml:space="preserve">UNIDAD DE MEDIDA</w:t>
+      </w:r>
+    </w:p>
+    <w:p>
+      <w:pPr>
+        <w:spacing w:after="100" w:before="0" w:line="276"/>
+        <w:jc w:val="both"/>
+      </w:pPr>
+      <w:r>
+        <w:rPr>
+          <w:rFonts w:ascii="Arial" w:cs="Arial" w:eastAsia="Arial" w:hAnsi="Arial"/>
+          <w:sz w:val="20"/>
+          <w:szCs w:val="20"/>
+        </w:rPr>
+        <w:t xml:space="preserve">La unidad de medida es: unidad (und).</w:t>
+      </w:r>
+    </w:p>
+    <w:p>
+      <w:pPr>
+        <w:keepNext/>
+        <w:spacing w:after="60" w:before="120"/>
+      </w:pPr>
+      <w:r>
+        <w:rPr>
+          <w:rFonts w:ascii="Arial" w:cs="Arial" w:eastAsia="Arial" w:hAnsi="Arial"/>
+          <w:b/>
+          <w:bCs/>
+          <w:color w:val="1F3864"/>
+          <w:sz w:val="19"/>
+          <w:szCs w:val="19"/>
+        </w:rPr>
+        <w:t xml:space="preserve">MÉTODO DE MEDICIÓN</w:t>
+      </w:r>
+    </w:p>
+    <w:p>
+      <w:pPr>
+        <w:spacing w:after="100" w:before="0" w:line="276"/>
+        <w:jc w:val="both"/>
+      </w:pPr>
+      <w:r>
+        <w:rPr>
+          <w:rFonts w:ascii="Arial" w:cs="Arial" w:eastAsia="Arial" w:hAnsi="Arial"/>
+          <w:sz w:val="20"/>
+          <w:szCs w:val="20"/>
+        </w:rPr>
+        <w:t xml:space="preserve">Se contará el número de tapas colocadas (2 por canaleta).</w:t>
+      </w:r>
+    </w:p>
+    <w:p>
+      <w:pPr>
+        <w:keepNext/>
+        <w:spacing w:after="60" w:before="120"/>
+      </w:pPr>
+      <w:r>
+        <w:rPr>
+          <w:rFonts w:ascii="Arial" w:cs="Arial" w:eastAsia="Arial" w:hAnsi="Arial"/>
+          <w:b/>
+          <w:bCs/>
+          <w:color w:val="1F3864"/>
+          <w:sz w:val="19"/>
+          <w:szCs w:val="19"/>
+        </w:rPr>
+        <w:t xml:space="preserve">FORMA DE PAGO</w:t>
+      </w:r>
+    </w:p>
+    <w:p>
+      <w:pPr>
+        <w:spacing w:after="100" w:before="0" w:line="276"/>
+        <w:jc w:val="both"/>
+      </w:pPr>
+      <w:r>
+        <w:rPr>
+          <w:rFonts w:ascii="Arial" w:cs="Arial" w:eastAsia="Arial" w:hAnsi="Arial"/>
+          <w:sz w:val="20"/>
+          <w:szCs w:val="20"/>
+        </w:rPr>
+        <w:t xml:space="preserve">El pago se efectuará al precio unitario del presupuesto por unidad (und), de acuerdo con el avance valorizado y con la conformidad de la Supervisión. Dicho precio y pago constituye compensación total por la mano de obra (incluidas las leyes sociales), los materiales, el equipo, las herramientas, el transporte interno y todo imprevisto necesario para ejecutar la partida según esta especificación y los planos.</w:t>
+      </w:r>
+    </w:p>
+    <w:p>
+      <w:pPr>
+        <w:pStyle w:val="Heading5"/>
+        <w:keepNext/>
+      </w:pPr>
+      <w:r>
+        <w:t xml:space="preserve">01.04.03.05.04.04  BOQUILLA DE PLANCHA GALVANIZADA P/CONEXIÓN DE CANALETA A TUBERIA PVC Ø4"  (und)</w:t>
+      </w:r>
+    </w:p>
+    <w:p>
+      <w:pPr>
+        <w:keepNext/>
+        <w:spacing w:after="60" w:before="120"/>
+      </w:pPr>
+      <w:r>
+        <w:rPr>
+          <w:rFonts w:ascii="Arial" w:cs="Arial" w:eastAsia="Arial" w:hAnsi="Arial"/>
+          <w:b/>
+          <w:bCs/>
+          <w:color w:val="1F3864"/>
+          <w:sz w:val="19"/>
+          <w:szCs w:val="19"/>
+        </w:rPr>
+        <w:t xml:space="preserve">DESCRIPCIÓN</w:t>
+      </w:r>
+    </w:p>
+    <w:p>
+      <w:pPr>
+        <w:spacing w:after="100" w:before="0" w:line="276"/>
+        <w:jc w:val="both"/>
+      </w:pPr>
+      <w:r>
+        <w:rPr>
+          <w:rFonts w:ascii="Arial" w:cs="Arial" w:eastAsia="Arial" w:hAnsi="Arial"/>
+          <w:sz w:val="20"/>
+          <w:szCs w:val="20"/>
+        </w:rPr>
+        <w:t xml:space="preserve">Comprende la fabricación y colocación de la boquilla de plancha galvanizada de 0.50 mm que conecta el fondo de cada canaleta de las bancas con la bajada de tubería PVC de 4": abertura de 0.10 m en el fondo, brida de 0.16 x 0.16 m remachada y sellada, y cuello de 0.10 x 0.15 m que entra en el niple de PVC. Reemplaza al sumidero tipo cupula del plano de la OC-01 (lámina DPL-42).</w:t>
+      </w:r>
+    </w:p>
+    <w:p>
+      <w:pPr>
+        <w:keepNext/>
+        <w:spacing w:after="60" w:before="120"/>
+      </w:pPr>
+      <w:r>
+        <w:rPr>
+          <w:rFonts w:ascii="Arial" w:cs="Arial" w:eastAsia="Arial" w:hAnsi="Arial"/>
+          <w:b/>
+          <w:bCs/>
+          <w:color w:val="1F3864"/>
+          <w:sz w:val="19"/>
+          <w:szCs w:val="19"/>
+        </w:rPr>
+        <w:t xml:space="preserve">MATERIALES</w:t>
+      </w:r>
+    </w:p>
+    <w:p>
+      <w:pPr>
+        <w:pStyle w:val="ListParagraph"/>
+        <w:numPr>
+          <w:ilvl w:val="0"/>
+          <w:numId w:val="2"/>
+        </w:numPr>
+        <w:spacing w:after="60" w:line="264"/>
+        <w:jc w:val="both"/>
+      </w:pPr>
+      <w:r>
+        <w:rPr>
+          <w:rFonts w:ascii="Arial" w:cs="Arial" w:eastAsia="Arial" w:hAnsi="Arial"/>
+          <w:sz w:val="20"/>
+          <w:szCs w:val="20"/>
+        </w:rPr>
+        <w:t xml:space="preserve">Plancha galvanizada de 0.50 mm; 8 remaches pop de 1/8" por boquilla; sellador de poliuretano.</w:t>
+      </w:r>
+    </w:p>
+    <w:p>
+      <w:pPr>
+        <w:keepNext/>
+        <w:spacing w:after="60" w:before="120"/>
+      </w:pPr>
+      <w:r>
+        <w:rPr>
+          <w:rFonts w:ascii="Arial" w:cs="Arial" w:eastAsia="Arial" w:hAnsi="Arial"/>
+          <w:b/>
+          <w:bCs/>
+          <w:color w:val="1F3864"/>
+          <w:sz w:val="19"/>
+          <w:szCs w:val="19"/>
+        </w:rPr>
+        <w:t xml:space="preserve">EQUIPOS Y HERRAMIENTAS</w:t>
+      </w:r>
+    </w:p>
+    <w:p>
+      <w:pPr>
+        <w:pStyle w:val="ListParagraph"/>
+        <w:numPr>
+          <w:ilvl w:val="0"/>
+          <w:numId w:val="2"/>
+        </w:numPr>
+        <w:spacing w:after="60" w:line="264"/>
+        <w:jc w:val="both"/>
+      </w:pPr>
+      <w:r>
+        <w:rPr>
+          <w:rFonts w:ascii="Arial" w:cs="Arial" w:eastAsia="Arial" w:hAnsi="Arial"/>
+          <w:sz w:val="20"/>
+          <w:szCs w:val="20"/>
+        </w:rPr>
+        <w:t xml:space="preserve">Tijera de hojalatero, remachadora, taladro, sacabocado.</w:t>
+      </w:r>
+    </w:p>
+    <w:p>
+      <w:pPr>
+        <w:keepNext/>
+        <w:spacing w:after="60" w:before="120"/>
+      </w:pPr>
+      <w:r>
+        <w:rPr>
+          <w:rFonts w:ascii="Arial" w:cs="Arial" w:eastAsia="Arial" w:hAnsi="Arial"/>
+          <w:b/>
+          <w:bCs/>
+          <w:color w:val="1F3864"/>
+          <w:sz w:val="19"/>
+          <w:szCs w:val="19"/>
+        </w:rPr>
+        <w:t xml:space="preserve">PROCEDIMIENTO DE EJECUCIÓN</w:t>
+      </w:r>
+    </w:p>
+    <w:p>
+      <w:pPr>
+        <w:pStyle w:val="ListParagraph"/>
+        <w:numPr>
+          <w:ilvl w:val="0"/>
+          <w:numId w:val="2"/>
+        </w:numPr>
+        <w:spacing w:after="60" w:line="264"/>
+        <w:jc w:val="both"/>
+      </w:pPr>
+      <w:r>
+        <w:rPr>
+          <w:rFonts w:ascii="Arial" w:cs="Arial" w:eastAsia="Arial" w:hAnsi="Arial"/>
+          <w:sz w:val="20"/>
+          <w:szCs w:val="20"/>
+        </w:rPr>
+        <w:t xml:space="preserve">Abrir el agujero de 0.10 m en el fondo de la canaleta en el punto de salida.</w:t>
+      </w:r>
+    </w:p>
+    <w:p>
+      <w:pPr>
+        <w:pStyle w:val="ListParagraph"/>
+        <w:numPr>
+          <w:ilvl w:val="0"/>
+          <w:numId w:val="2"/>
+        </w:numPr>
+        <w:spacing w:after="60" w:line="264"/>
+        <w:jc w:val="both"/>
+      </w:pPr>
+      <w:r>
+        <w:rPr>
+          <w:rFonts w:ascii="Arial" w:cs="Arial" w:eastAsia="Arial" w:hAnsi="Arial"/>
+          <w:sz w:val="20"/>
+          <w:szCs w:val="20"/>
+        </w:rPr>
+        <w:t xml:space="preserve">Fabricar la boquilla con su brida y cuello.</w:t>
+      </w:r>
+    </w:p>
+    <w:p>
+      <w:pPr>
+        <w:pStyle w:val="ListParagraph"/>
+        <w:numPr>
+          <w:ilvl w:val="0"/>
+          <w:numId w:val="2"/>
+        </w:numPr>
+        <w:spacing w:after="60" w:line="264"/>
+        <w:jc w:val="both"/>
+      </w:pPr>
+      <w:r>
+        <w:rPr>
+          <w:rFonts w:ascii="Arial" w:cs="Arial" w:eastAsia="Arial" w:hAnsi="Arial"/>
+          <w:sz w:val="20"/>
+          <w:szCs w:val="20"/>
+        </w:rPr>
+        <w:t xml:space="preserve">Remachar y sellar la brida a la canaleta e insertar el cuello en el niple de PVC de 4".</w:t>
+      </w:r>
+    </w:p>
+    <w:p>
+      <w:pPr>
+        <w:keepNext/>
+        <w:spacing w:after="60" w:before="120"/>
+      </w:pPr>
+      <w:r>
+        <w:rPr>
+          <w:rFonts w:ascii="Arial" w:cs="Arial" w:eastAsia="Arial" w:hAnsi="Arial"/>
+          <w:b/>
+          <w:bCs/>
+          <w:color w:val="1F3864"/>
+          <w:sz w:val="19"/>
+          <w:szCs w:val="19"/>
+        </w:rPr>
+        <w:t xml:space="preserve">CONTROL DE CALIDAD Y TOLERANCIAS</w:t>
+      </w:r>
+    </w:p>
+    <w:p>
+      <w:pPr>
+        <w:pStyle w:val="ListParagraph"/>
+        <w:numPr>
+          <w:ilvl w:val="0"/>
+          <w:numId w:val="2"/>
+        </w:numPr>
+        <w:spacing w:after="60" w:line="264"/>
+        <w:jc w:val="both"/>
+      </w:pPr>
+      <w:r>
+        <w:rPr>
+          <w:rFonts w:ascii="Arial" w:cs="Arial" w:eastAsia="Arial" w:hAnsi="Arial"/>
+          <w:sz w:val="20"/>
+          <w:szCs w:val="20"/>
+        </w:rPr>
+        <w:t xml:space="preserve">Sin filtraciones; la canaleta descarga totalmente por la boquilla.</w:t>
+      </w:r>
+    </w:p>
+    <w:p>
+      <w:pPr>
+        <w:keepNext/>
+        <w:spacing w:after="60" w:before="120"/>
+      </w:pPr>
+      <w:r>
+        <w:rPr>
+          <w:rFonts w:ascii="Arial" w:cs="Arial" w:eastAsia="Arial" w:hAnsi="Arial"/>
+          <w:b/>
+          <w:bCs/>
+          <w:color w:val="1F3864"/>
+          <w:sz w:val="19"/>
+          <w:szCs w:val="19"/>
+        </w:rPr>
+        <w:t xml:space="preserve">SEGURIDAD Y SALUD EN EL TRABAJO</w:t>
+      </w:r>
+    </w:p>
+    <w:p>
+      <w:pPr>
+        <w:pStyle w:val="ListParagraph"/>
+        <w:numPr>
+          <w:ilvl w:val="0"/>
+          <w:numId w:val="2"/>
+        </w:numPr>
+        <w:spacing w:after="60" w:line="264"/>
+        <w:jc w:val="both"/>
+      </w:pPr>
+      <w:r>
+        <w:rPr>
+          <w:rFonts w:ascii="Arial" w:cs="Arial" w:eastAsia="Arial" w:hAnsi="Arial"/>
+          <w:sz w:val="20"/>
+          <w:szCs w:val="20"/>
+        </w:rPr>
+        <w:t xml:space="preserve">Uso obligatorio de equipo de protección personal: casco, lentes de seguridad, guantes, botas con puntera de acero y chaleco reflectivo (DS N.° 011-2019-TR y Norma G.050).</w:t>
+      </w:r>
+    </w:p>
+    <w:p>
+      <w:pPr>
+        <w:pStyle w:val="ListParagraph"/>
+        <w:numPr>
+          <w:ilvl w:val="0"/>
+          <w:numId w:val="2"/>
+        </w:numPr>
+        <w:spacing w:after="60" w:line="264"/>
+        <w:jc w:val="both"/>
+      </w:pPr>
+      <w:r>
+        <w:rPr>
+          <w:rFonts w:ascii="Arial" w:cs="Arial" w:eastAsia="Arial" w:hAnsi="Arial"/>
+          <w:sz w:val="20"/>
+          <w:szCs w:val="20"/>
+        </w:rPr>
+        <w:t xml:space="preserve">Trabajo a 2.80 m de altura sobre la banca: escalera de tijera o andamio estable, arnés cuando no se trabaje desde plataforma (Norma G.050).</w:t>
+      </w:r>
+    </w:p>
+    <w:p>
+      <w:pPr>
+        <w:pStyle w:val="ListParagraph"/>
+        <w:numPr>
+          <w:ilvl w:val="0"/>
+          <w:numId w:val="2"/>
+        </w:numPr>
+        <w:spacing w:after="60" w:line="264"/>
+        <w:jc w:val="both"/>
+      </w:pPr>
+      <w:r>
+        <w:rPr>
+          <w:rFonts w:ascii="Arial" w:cs="Arial" w:eastAsia="Arial" w:hAnsi="Arial"/>
+          <w:sz w:val="20"/>
+          <w:szCs w:val="20"/>
+        </w:rPr>
+        <w:t xml:space="preserve">Guantes de cuero para manipular la plancha; proteger los bordes cortados.</w:t>
+      </w:r>
+    </w:p>
+    <w:p>
+      <w:pPr>
+        <w:keepNext/>
+        <w:spacing w:after="60" w:before="120"/>
+      </w:pPr>
+      <w:r>
+        <w:rPr>
+          <w:rFonts w:ascii="Arial" w:cs="Arial" w:eastAsia="Arial" w:hAnsi="Arial"/>
+          <w:b/>
+          <w:bCs/>
+          <w:color w:val="1F3864"/>
+          <w:sz w:val="19"/>
+          <w:szCs w:val="19"/>
+        </w:rPr>
+        <w:t xml:space="preserve">UNIDAD DE MEDIDA</w:t>
+      </w:r>
+    </w:p>
+    <w:p>
+      <w:pPr>
+        <w:spacing w:after="100" w:before="0" w:line="276"/>
+        <w:jc w:val="both"/>
+      </w:pPr>
+      <w:r>
+        <w:rPr>
+          <w:rFonts w:ascii="Arial" w:cs="Arial" w:eastAsia="Arial" w:hAnsi="Arial"/>
+          <w:sz w:val="20"/>
+          <w:szCs w:val="20"/>
+        </w:rPr>
+        <w:t xml:space="preserve">La unidad de medida es: unidad (und).</w:t>
+      </w:r>
+    </w:p>
+    <w:p>
+      <w:pPr>
+        <w:keepNext/>
+        <w:spacing w:after="60" w:before="120"/>
+      </w:pPr>
+      <w:r>
+        <w:rPr>
+          <w:rFonts w:ascii="Arial" w:cs="Arial" w:eastAsia="Arial" w:hAnsi="Arial"/>
+          <w:b/>
+          <w:bCs/>
+          <w:color w:val="1F3864"/>
+          <w:sz w:val="19"/>
+          <w:szCs w:val="19"/>
+        </w:rPr>
+        <w:t xml:space="preserve">MÉTODO DE MEDICIÓN</w:t>
+      </w:r>
+    </w:p>
+    <w:p>
+      <w:pPr>
+        <w:spacing w:after="100" w:before="0" w:line="276"/>
+        <w:jc w:val="both"/>
+      </w:pPr>
+      <w:r>
+        <w:rPr>
+          <w:rFonts w:ascii="Arial" w:cs="Arial" w:eastAsia="Arial" w:hAnsi="Arial"/>
+          <w:sz w:val="20"/>
+          <w:szCs w:val="20"/>
+        </w:rPr>
+        <w:t xml:space="preserve">Se contará el número de boquillas instaladas (1 por canaleta).</w:t>
+      </w:r>
+    </w:p>
+    <w:p>
+      <w:pPr>
+        <w:keepNext/>
+        <w:spacing w:after="60" w:before="120"/>
+      </w:pPr>
+      <w:r>
+        <w:rPr>
+          <w:rFonts w:ascii="Arial" w:cs="Arial" w:eastAsia="Arial" w:hAnsi="Arial"/>
+          <w:b/>
+          <w:bCs/>
+          <w:color w:val="1F3864"/>
+          <w:sz w:val="19"/>
+          <w:szCs w:val="19"/>
+        </w:rPr>
+        <w:t xml:space="preserve">FORMA DE PAGO</w:t>
+      </w:r>
+    </w:p>
+    <w:p>
+      <w:pPr>
+        <w:spacing w:after="100" w:before="0" w:line="276"/>
+        <w:jc w:val="both"/>
+      </w:pPr>
+      <w:r>
+        <w:rPr>
+          <w:rFonts w:ascii="Arial" w:cs="Arial" w:eastAsia="Arial" w:hAnsi="Arial"/>
+          <w:sz w:val="20"/>
+          <w:szCs w:val="20"/>
+        </w:rPr>
+        <w:t xml:space="preserve">El pago se efectuará al precio unitario del presupuesto por unidad (und), de acuerdo con el avance valorizado y con la conformidad de la Supervisión. Dicho precio y pago constituye compensación total por la mano de obra (incluidas las leyes sociales), los materiales, el equipo, las herramientas, el transporte interno y todo imprevisto necesario para ejecutar la partida según esta especificación y los planos.</w:t>
+      </w:r>
+    </w:p>
+    <w:p>
+      <w:pPr>
         <w:pStyle w:val="Heading2"/>
         <w:keepNext/>
         <w:pageBreakBefore/>
@@ -20507,7 +22072,7 @@
           <w:sz w:val="20"/>
           <w:szCs w:val="20"/>
         </w:rPr>
-        <w:t xml:space="preserve">Comprende el registro de limpieza completo del colector pluvial frontal del Hogar de Refugio Temporal con tapa CIEGA de concreto armado, sin marco ni contramarco metálico: rebaje de 0.70 x 0.70 x 0.08 m formado en la losa superior como asiento de la tapa (0.05 m por lado), luz libre de 0.60 x 0.60 m, borde engrosado de 0.15 x 0.10 m bajo la losa con refuerzo de borde de 2 barras de 1/2" por lado (L = 1.40 m), y tapa de concreto armado f'c = 210 kg/cm² de 0.68 x 0.68 x 0.08 m vaciada aparte en obra, con parrilla de 7 + 7 barras de 3/8" @0.10 m, dos asas de fierro liso de 1/2" (0.50 m) en cajuelas de 0.19 x 0.06 x 0.03 m y cantos biselados de 1 x 1 cm, todo según las láminas DP-06B, DP-06D, DD-01 y DD-02.</w:t>
+        <w:t xml:space="preserve">Comprende el registro de limpieza completo del colector pluvial frontal del Hogar de Refugio Temporal con tapa CIEGA de concreto armado, sin marco ni contramarco metálico: rebaje de 0.70 x 0.70 x 0.08 m formado en la losa superior como asiento de la tapa (0.05 m por lado), luz libre de 0.60 x 0.60 m, borde engrosado de 0.15 x 0.10 m bajo la losa con refuerzo de borde de 2 barras de 1/2" por lado (L = 1.40 m), y tapa de concreto armado f'c = 210 kg/cm² de 0.68 x 0.68 x 0.08 m vaciada aparte en obra, con parrilla de 7 + 7 barras de 3/8" @0.10 m, dos asas de fierro liso de 1/2" (0.50 m) en cajuelas de 0.19 x 0.06 x 0.03 m y cantos biselados de 1 x 1 cm, todo según las láminas DPL-24 y DPL-29.</w:t>
       </w:r>
     </w:p>
     <w:p>
@@ -20938,7 +22503,7 @@
           <w:sz w:val="20"/>
           <w:szCs w:val="20"/>
         </w:rPr>
-        <w:t xml:space="preserve">Comprende la junta de dilatación de 1" (25 mm) en toda la sección del colector pluvial frontal del Hogar de Refugio Temporal, cada 4.00 m (17 juntas) y en los cambios de sección, rellena con plancha de poliestireno expandido (tecnopor) y sellada con sellador asfáltico de 1" x 2" (25 x 50 mm) de asfalto líquido RC-250 y arena gruesa en las caras interiores y en la cara superior, según la lámina DD-03 y la sección 510 de la EG-2013 del MTC.</w:t>
+        <w:t xml:space="preserve">Comprende la junta de dilatación de 1" (25 mm) en toda la sección del colector pluvial frontal del Hogar de Refugio Temporal, cada 4.00 m (17 juntas) y en los cambios de sección, rellena con plancha de poliestireno expandido (tecnopor) y sellada con sellador asfáltico de 1" x 2" (25 x 50 mm) de asfalto líquido RC-250 y arena gruesa en las caras interiores y en la cara superior, según la lámina DPL-28 y la sección 510 de la EG-2013 del MTC.</w:t>
       </w:r>
     </w:p>
     <w:p>
@@ -21346,7 +22911,7 @@
           <w:sz w:val="20"/>
           <w:szCs w:val="20"/>
         </w:rPr>
-        <w:t xml:space="preserve">Comprende la junta longitudinal de 1" con plancha de poliestireno expandido (tecnopor) y sellador asfáltico entre el muro del colector pluvial frontal del Hogar de Refugio Temporal (lado predio) y el cimiento del cerco existente, en todo el tramo del colector pegado al cerco (0+000.00 a 0+058.81), con plancha de 0.90 m de altura, de modo que el colector y el cerco trabajen en forma independiente. En la cara superior de la junta se coloca sellador asfáltico de 1" x 2" (asfalto líquido RC-250 + arena gruesa), según la lámina DD-03. Al otro lado del colector (lado vía) hay terreno natural y no lleva junta; la losa superior del colector sirve de vereda.</w:t>
+        <w:t xml:space="preserve">Comprende la junta longitudinal de 1" con plancha de poliestireno expandido (tecnopor) y sellador asfáltico entre el muro del colector pluvial frontal del Hogar de Refugio Temporal (lado predio) y el cimiento del cerco existente, en todo el tramo del colector pegado al cerco (0+000.00 a 0+058.81), con plancha de 0.90 m de altura, de modo que el colector y el cerco trabajen en forma independiente. En la cara superior de la junta se coloca sellador asfáltico de 1" x 2" (asfalto líquido RC-250 + arena gruesa), según la lámina DPL-28. Al otro lado del colector (lado vía) hay terreno natural y no lleva junta; la losa superior del colector sirve de vereda.</w:t>
       </w:r>
     </w:p>
     <w:p>

</xml_diff>

<commit_message>
Hogar de Refugio: especificaciones sin citas a laminas DJ que no existen en el juego DPL
Co-Authored-By: Claude Opus 5.5 <noreply@anthropic.com>
Claude-Session: https://claude.ai/code/session_0142t8T16igb3VKxUPwnQPq6
</commit_message>
<xml_diff>
--- a/entregables/ESPECIFICACIONES_TECNICAS_DRENAJE_PLUVIAL_HOGAR_REFUGIO.docx
+++ b/entregables/ESPECIFICACIONES_TECNICAS_DRENAJE_PLUVIAL_HOGAR_REFUGIO.docx
@@ -8029,7 +8029,7 @@
           <w:sz w:val="20"/>
           <w:szCs w:val="20"/>
         </w:rPr>
-        <w:t xml:space="preserve">Según la lámina DJ-03: cada módulo de 1.00 m (0.997 m fabricado, 3 mm de holgura entre módulos) tiene 2 ángulos L 1" x 1" x 3/16" con el ala horizontal apoyada en el rebaje y el ala vertical hacia la cuneta, y 39 platinas de 1" x 3/16" x 0.446 m de canto @1" entre ejes (abertura libre 0.021 m), soldadas a tope al ala vertical. El módulo mide 0.497 m de ancho y se apoya en el rebaje de 0.05 x 1" del borde interior de cada muro, a ras del borde superior de la cuneta; pesa 20.0 kg por metro.</w:t>
+        <w:t xml:space="preserve">Cada módulo de 1.00 m (0.997 m fabricado, 3 mm de holgura entre módulos) tiene 2 ángulos L 1" x 1" x 3/16" con el ala horizontal apoyada en el rebaje y el ala vertical hacia la cuneta, y 39 platinas de 1" x 3/16" x 0.446 m de canto @1" entre ejes (abertura libre 0.021 m), soldadas a tope al ala vertical. El módulo mide 0.497 m de ancho y se apoya en el rebaje de 0.05 x 1" del borde interior de cada muro, a ras del borde superior de la cuneta; pesa 20.0 kg por metro.</w:t>
       </w:r>
     </w:p>
     <w:p>
@@ -8859,7 +8859,7 @@
           <w:sz w:val="20"/>
           <w:szCs w:val="20"/>
         </w:rPr>
-        <w:t xml:space="preserve">Comprende las juntas de dilatación de 1" (0.0254 m) de las cunetas, cada 3.00 m y en los cambios de dirección, en toda la sección en U: los dos muros y la losa de fondo, de modo que cada tramo entre juntas trabaje independiente, según la EG-2013 MTC, Sección 510 (cunetas revestidas de concreto). La junta lleva plancha de tecnopor de 1" en todo el espesor y sellador asfáltico (asfalto líquido RC-250 + arena gruesa) en la cara interior, según las láminas DJ-01 y DJ-02.</w:t>
+        <w:t xml:space="preserve">Comprende las juntas de dilatación de 1" (0.0254 m) de las cunetas, cada 3.00 m y en los cambios de dirección, en toda la sección en U: los dos muros y la losa de fondo, de modo que cada tramo entre juntas trabaje independiente, según la EG-2013 MTC, Sección 510 (cunetas revestidas de concreto). La junta lleva plancha de tecnopor de 1" en todo el espesor y sellador asfáltico (asfalto líquido RC-250 + arena gruesa) en la cara interior.</w:t>
       </w:r>
     </w:p>
     <w:p>

</xml_diff>